<commit_message>
ajout des alert fake
</commit_message>
<xml_diff>
--- a/Guide_Deploiement.docx
+++ b/Guide_Deploiement.docx
@@ -17,42 +17,8 @@
           <w:sz w:val="34"/>
           <w:szCs w:val="34"/>
         </w:rPr>
-        <w:t xml:space="preserve">Guide de déploiement — Stack </w:t>
-      </w:r>
-      <w:proofErr w:type="spellStart"/>
-      <w:r>
-        <w:rPr>
-          <w:b/>
-          <w:bCs/>
-          <w:color w:val="1F3A5F"/>
-          <w:sz w:val="34"/>
-          <w:szCs w:val="34"/>
-        </w:rPr>
-        <w:t>Prometheus</w:t>
-      </w:r>
-      <w:proofErr w:type="spellEnd"/>
-      <w:r>
-        <w:rPr>
-          <w:b/>
-          <w:bCs/>
-          <w:color w:val="1F3A5F"/>
-          <w:sz w:val="34"/>
-          <w:szCs w:val="34"/>
-        </w:rPr>
-        <w:t xml:space="preserve"> + </w:t>
-      </w:r>
-      <w:proofErr w:type="spellStart"/>
-      <w:r>
-        <w:rPr>
-          <w:b/>
-          <w:bCs/>
-          <w:color w:val="1F3A5F"/>
-          <w:sz w:val="34"/>
-          <w:szCs w:val="34"/>
-        </w:rPr>
-        <w:t>Grafana</w:t>
-      </w:r>
-      <w:proofErr w:type="spellEnd"/>
+        <w:t>Guide de déploiement — Stack Prometheus + Grafana</w:t>
+      </w:r>
     </w:p>
     <w:p>
       <w:pPr>
@@ -1238,31 +1204,7 @@
         <w:t xml:space="preserve">Ce guide accompagne pas à pas le déploiement de la plateforme de supervision du Projet 01. Il s’adresse à une mise en œuvre </w:t>
       </w:r>
       <w:r>
-        <w:t xml:space="preserve">sur un poste de travail personnel et reprend l’architecture décrite dans le rapport associé : trois machines virtuelles Debian 13 hébergées sous VirtualBox, sur lesquelles s’installent </w:t>
-      </w:r>
-      <w:proofErr w:type="spellStart"/>
-      <w:r>
-        <w:t>Prometheus</w:t>
-      </w:r>
-      <w:proofErr w:type="spellEnd"/>
-      <w:r>
-        <w:t xml:space="preserve">, </w:t>
-      </w:r>
-      <w:proofErr w:type="spellStart"/>
-      <w:r>
-        <w:t>Grafana</w:t>
-      </w:r>
-      <w:proofErr w:type="spellEnd"/>
-      <w:r>
-        <w:t xml:space="preserve">, </w:t>
-      </w:r>
-      <w:proofErr w:type="spellStart"/>
-      <w:r>
-        <w:t>AlertManager</w:t>
-      </w:r>
-      <w:proofErr w:type="spellEnd"/>
-      <w:r>
-        <w:t>, Node Exporter, une application web i</w:t>
+        <w:t>sur un poste de travail personnel et reprend l’architecture décrite dans le rapport associé : trois machines virtuelles Debian 13 hébergées sous VirtualBox, sur lesquelles s’installent Prometheus, Grafana, AlertManager, Node Exporter, une application web i</w:t>
       </w:r>
       <w:r>
         <w:t>nstrumentée et une base de données PostgreSQL.</w:t>
@@ -1292,104 +1234,6 @@
         <w:t>ent les opérations répétitives ; le guide en explique le contenu et l’ordre d’exécution, afin que chaque commande reste comprise et non simplement copiée.</w:t>
       </w:r>
     </w:p>
-    <w:tbl>
-      <w:tblPr>
-        <w:tblW w:w="9360" w:type="dxa"/>
-        <w:tblBorders>
-          <w:top w:val="single" w:sz="4" w:space="0" w:color="auto"/>
-          <w:left w:val="single" w:sz="4" w:space="0" w:color="auto"/>
-          <w:bottom w:val="single" w:sz="4" w:space="0" w:color="auto"/>
-          <w:right w:val="single" w:sz="4" w:space="0" w:color="auto"/>
-          <w:insideH w:val="single" w:sz="4" w:space="0" w:color="auto"/>
-          <w:insideV w:val="single" w:sz="4" w:space="0" w:color="auto"/>
-        </w:tblBorders>
-        <w:tblCellMar>
-          <w:left w:w="10" w:type="dxa"/>
-          <w:right w:w="10" w:type="dxa"/>
-        </w:tblCellMar>
-        <w:tblLook w:val="04A0" w:firstRow="1" w:lastRow="0" w:firstColumn="1" w:lastColumn="0" w:noHBand="0" w:noVBand="1"/>
-      </w:tblPr>
-      <w:tblGrid>
-        <w:gridCol w:w="9360"/>
-      </w:tblGrid>
-      <w:tr>
-        <w:tblPrEx>
-          <w:tblCellMar>
-            <w:top w:w="0" w:type="dxa"/>
-            <w:bottom w:w="0" w:type="dxa"/>
-          </w:tblCellMar>
-        </w:tblPrEx>
-        <w:tc>
-          <w:tcPr>
-            <w:tcW w:w="9360" w:type="dxa"/>
-            <w:tcBorders>
-              <w:top w:val="single" w:sz="4" w:space="6" w:color="E0A800"/>
-              <w:left w:val="single" w:sz="4" w:space="6" w:color="E0A800"/>
-              <w:bottom w:val="single" w:sz="4" w:space="6" w:color="E0A800"/>
-              <w:right w:val="single" w:sz="4" w:space="6" w:color="E0A800"/>
-            </w:tcBorders>
-            <w:shd w:val="clear" w:color="auto" w:fill="FFF7E6"/>
-            <w:tcMar>
-              <w:top w:w="140" w:type="dxa"/>
-              <w:left w:w="180" w:type="dxa"/>
-              <w:bottom w:w="140" w:type="dxa"/>
-              <w:right w:w="180" w:type="dxa"/>
-            </w:tcMar>
-          </w:tcPr>
-          <w:p>
-            <w:pPr>
-              <w:spacing w:after="60"/>
-            </w:pPr>
-            <w:r>
-              <w:rPr>
-                <w:b/>
-                <w:bCs/>
-                <w:color w:val="8A6D00"/>
-                <w:sz w:val="21"/>
-                <w:szCs w:val="21"/>
-              </w:rPr>
-              <w:t>Convention de lecture</w:t>
-            </w:r>
-          </w:p>
-          <w:p>
-            <w:pPr>
-              <w:spacing w:after="40" w:line="264" w:lineRule="auto"/>
-              <w:jc w:val="both"/>
-            </w:pPr>
-            <w:r>
-              <w:rPr>
-                <w:sz w:val="20"/>
-                <w:szCs w:val="20"/>
-              </w:rPr>
-              <w:t>Les commandes précédées de « $ » s’exécutent dans un terminal en tant qu’utilis</w:t>
-            </w:r>
-            <w:r>
-              <w:rPr>
-                <w:sz w:val="20"/>
-                <w:szCs w:val="20"/>
-              </w:rPr>
-              <w:t xml:space="preserve">ateur courant ; celles précédées de « # » nécessitent les privilèges administrateur (root), obtenus avec </w:t>
-            </w:r>
-            <w:proofErr w:type="spellStart"/>
-            <w:r>
-              <w:rPr>
-                <w:sz w:val="20"/>
-                <w:szCs w:val="20"/>
-              </w:rPr>
-              <w:t>sudo</w:t>
-            </w:r>
-            <w:proofErr w:type="spellEnd"/>
-            <w:r>
-              <w:rPr>
-                <w:sz w:val="20"/>
-                <w:szCs w:val="20"/>
-              </w:rPr>
-              <w:t>. Les valeurs entre chevrons, comme &lt;IP_SERVEUR&gt;, sont à remplacer par les vôtres.</w:t>
-            </w:r>
-          </w:p>
-        </w:tc>
-      </w:tr>
-    </w:tbl>
     <w:p>
       <w:pPr>
         <w:pStyle w:val="Titre1"/>
@@ -2075,15 +1919,7 @@
         <w:jc w:val="both"/>
       </w:pPr>
       <w:r>
-        <w:t xml:space="preserve">La répartition des 12 Go alloués aux machines virtuelles est la suivante : 4 Go pour </w:t>
-      </w:r>
-      <w:proofErr w:type="spellStart"/>
-      <w:r>
-        <w:t>srv</w:t>
-      </w:r>
-      <w:proofErr w:type="spellEnd"/>
-      <w:r>
-        <w:t xml:space="preserve">-monitor (qui héberge l’essentiel de la pile), 3 Go pour srv-web01 et 3 Go pour srv-db01, soit 10 Go effectivement consommés et une marge de 2 Go pour le confort. Côté </w:t>
+        <w:t xml:space="preserve">La répartition des 12 Go alloués aux machines virtuelles est la suivante : 4 Go pour srv-monitor (qui héberge l’essentiel de la pile), 3 Go pour srv-web01 et 3 Go pour srv-db01, soit 10 Go effectivement consommés et une marge de 2 Go pour le confort. Côté </w:t>
       </w:r>
       <w:r>
         <w:t>stockage, les trois disques (40 + 25 + 25 Go) totalisent 90 Go, sous la limite des 100 Go.</w:t>
@@ -2109,7 +1945,14 @@
         <w:jc w:val="both"/>
       </w:pPr>
       <w:r>
-        <w:t>VirtualBox installé sur le poste Windows (avec son Extension Pack).</w:t>
+        <w:rPr>
+          <w:b/>
+          <w:bCs/>
+        </w:rPr>
+        <w:t>VirtualBox</w:t>
+      </w:r>
+      <w:r>
+        <w:t xml:space="preserve"> installé sur le poste Windows (avec son Extension Pack).</w:t>
       </w:r>
     </w:p>
     <w:p>
@@ -2123,18 +1966,17 @@
         <w:jc w:val="both"/>
       </w:pPr>
       <w:r>
-        <w:t>L’image d’installation de Debian 13 (fichier ISO, version «</w:t>
-      </w:r>
-      <w:r>
-        <w:t xml:space="preserve"> </w:t>
-      </w:r>
-      <w:proofErr w:type="spellStart"/>
-      <w:r>
-        <w:t>netinst</w:t>
-      </w:r>
-      <w:proofErr w:type="spellEnd"/>
-      <w:r>
-        <w:t xml:space="preserve"> » suffisante).</w:t>
+        <w:rPr>
+          <w:b/>
+          <w:bCs/>
+        </w:rPr>
+        <w:t>L’image d’installation de Debian 13</w:t>
+      </w:r>
+      <w:r>
+        <w:t xml:space="preserve"> (fichier ISO, version «</w:t>
+      </w:r>
+      <w:r>
+        <w:t xml:space="preserve"> netinst » suffisante).</w:t>
       </w:r>
     </w:p>
     <w:p>
@@ -2148,17 +1990,48 @@
         <w:jc w:val="both"/>
       </w:pPr>
       <w:r>
-        <w:lastRenderedPageBreak/>
-        <w:t>Les fichiers du projet (scripts et configurations), transférables vers les VM par dossier partagé ou par dépôt Git.</w:t>
+        <w:t xml:space="preserve">Les </w:t>
+      </w:r>
+      <w:r>
+        <w:rPr>
+          <w:b/>
+          <w:bCs/>
+        </w:rPr>
+        <w:t>fichiers du projet</w:t>
+      </w:r>
+      <w:r>
+        <w:t xml:space="preserve"> (scripts et configurations), transférables vers les VM par dossier partagé ou par dépôt Git.</w:t>
       </w:r>
     </w:p>
     <w:p>
       <w:pPr>
+        <w:spacing w:after="60" w:line="264" w:lineRule="auto"/>
+        <w:jc w:val="both"/>
+      </w:pPr>
+    </w:p>
+    <w:p>
+      <w:pPr>
+        <w:spacing w:after="60" w:line="264" w:lineRule="auto"/>
+        <w:jc w:val="both"/>
+      </w:pPr>
+    </w:p>
+    <w:p>
+      <w:pPr>
+        <w:spacing w:after="60" w:line="264" w:lineRule="auto"/>
+        <w:jc w:val="both"/>
+      </w:pPr>
+    </w:p>
+    <w:p>
+      <w:pPr>
         <w:pStyle w:val="Titre1"/>
       </w:pPr>
       <w:bookmarkStart w:id="2" w:name="_Toc232510080"/>
       <w:r>
-        <w:t>3. Préparation de VirtualBox</w:t>
+        <w:lastRenderedPageBreak/>
+        <w:t>3</w:t>
+      </w:r>
+      <w:r>
+        <w:t>. Préparation de VirtualBox</w:t>
       </w:r>
       <w:bookmarkEnd w:id="2"/>
     </w:p>
@@ -2181,26 +2054,10 @@
         <w:t>Les trois VM communiquent sur un réseau privé hôte (</w:t>
       </w:r>
       <w:r>
-        <w:t>Host-</w:t>
-      </w:r>
-      <w:proofErr w:type="spellStart"/>
-      <w:r>
-        <w:t>Only</w:t>
-      </w:r>
-      <w:proofErr w:type="spellEnd"/>
-      <w:r>
-        <w:t>), isolé d’Internet, en 192.168.56.0/24. Ce réseau permet à l’hôte Windows et aux VM de se joindre mutuellement, tout en gardant la supervision à l’écart de l’extérieur. Dans VirtualBox, ouvrez « Fichier → Outils → Gestionnaire de réseau hôte », p</w:t>
-      </w:r>
-      <w:r>
-        <w:t>uis créez un réseau Host-</w:t>
-      </w:r>
-      <w:proofErr w:type="spellStart"/>
-      <w:r>
-        <w:t>Only</w:t>
-      </w:r>
-      <w:proofErr w:type="spellEnd"/>
-      <w:r>
-        <w:t xml:space="preserve"> nommé vboxnet0 avec l’adresse 192.168.56.1 et le masque 255.255.255.0. Désactivez le serveur DHCP : les adresses seront fixées manuellement.</w:t>
+        <w:t>Host-Only), isolé d’Internet, en 192.168.56.0/24. Ce réseau permet à l’hôte Windows et aux VM de se joindre mutuellement, tout en gardant la supervision à l’écart de l’extérieur. Dans VirtualBox, ouvrez « Fichier → Outils → Gestionnaire de réseau hôte », p</w:t>
+      </w:r>
+      <w:r>
+        <w:t>uis créez un réseau Host-Only nommé vboxnet0 avec l’adresse 192.168.56.1 et le masque 255.255.255.0. Désactivez le serveur DHCP : les adresses seront fixées manuellement.</w:t>
       </w:r>
     </w:p>
     <w:tbl>
@@ -2253,7 +2110,6 @@
               <w:spacing w:after="60"/>
               <w:jc w:val="center"/>
             </w:pPr>
-            <w:proofErr w:type="gramStart"/>
             <w:r>
               <w:rPr>
                 <w:b/>
@@ -2272,31 +2128,8 @@
                 <w:sz w:val="21"/>
                 <w:szCs w:val="21"/>
               </w:rPr>
-              <w:t xml:space="preserve">  Capture</w:t>
-            </w:r>
-            <w:proofErr w:type="gramEnd"/>
-            <w:r>
-              <w:rPr>
-                <w:b/>
-                <w:bCs/>
-                <w:color w:val="1F3A5F"/>
-                <w:sz w:val="21"/>
-                <w:szCs w:val="21"/>
-              </w:rPr>
-              <w:t xml:space="preserve"> 1 — Réseau Host-</w:t>
-            </w:r>
-            <w:proofErr w:type="spellStart"/>
-            <w:r>
-              <w:rPr>
-                <w:b/>
-                <w:bCs/>
-                <w:color w:val="1F3A5F"/>
-                <w:sz w:val="21"/>
-                <w:szCs w:val="21"/>
-              </w:rPr>
-              <w:t>Only</w:t>
-            </w:r>
-            <w:proofErr w:type="spellEnd"/>
+              <w:t xml:space="preserve">  Capture 1 — Réseau Host-Only</w:t>
+            </w:r>
           </w:p>
           <w:p>
             <w:pPr>
@@ -2318,23 +2151,13 @@
             <w:pPr>
               <w:jc w:val="center"/>
             </w:pPr>
-            <w:proofErr w:type="gramStart"/>
             <w:r>
               <w:rPr>
                 <w:color w:val="9DB8D2"/>
                 <w:sz w:val="18"/>
                 <w:szCs w:val="18"/>
               </w:rPr>
-              <w:t>[ Insérer</w:t>
-            </w:r>
-            <w:proofErr w:type="gramEnd"/>
-            <w:r>
-              <w:rPr>
-                <w:color w:val="9DB8D2"/>
-                <w:sz w:val="18"/>
-                <w:szCs w:val="18"/>
-              </w:rPr>
-              <w:t xml:space="preserve"> la capture d’écran ici ]</w:t>
+              <w:t>[ Insérer la capture d’écran ici ]</w:t>
             </w:r>
           </w:p>
         </w:tc>
@@ -2364,15 +2187,7 @@
         <w:t xml:space="preserve">Chaque machine virtuelle dispose de deux interfaces réseau. La première, en mode NAT, donne accès </w:t>
       </w:r>
       <w:r>
-        <w:t>à Internet pour les téléchargements de paquets. La seconde, raccordée au réseau Host-</w:t>
-      </w:r>
-      <w:proofErr w:type="spellStart"/>
-      <w:r>
-        <w:t>Only</w:t>
-      </w:r>
-      <w:proofErr w:type="spellEnd"/>
-      <w:r>
-        <w:t xml:space="preserve"> vboxnet0, porte l’adresse fixe du serveur sur le segment de supervision. Cette séparation reflète une bonne pratique : le trafic de gestion est distinct du trafic sor</w:t>
+        <w:t>à Internet pour les téléchargements de paquets. La seconde, raccordée au réseau Host-Only vboxnet0, porte l’adresse fixe du serveur sur le segment de supervision. Cette séparation reflète une bonne pratique : le trafic de gestion est distinct du trafic sor</w:t>
       </w:r>
       <w:r>
         <w:t>tant.</w:t>
@@ -2500,29 +2315,7 @@
                 <w:sz w:val="20"/>
                 <w:szCs w:val="20"/>
               </w:rPr>
-              <w:t>Carte 2 (Host-</w:t>
-            </w:r>
-            <w:proofErr w:type="spellStart"/>
-            <w:r>
-              <w:rPr>
-                <w:b/>
-                <w:bCs/>
-                <w:color w:val="FFFFFF"/>
-                <w:sz w:val="20"/>
-                <w:szCs w:val="20"/>
-              </w:rPr>
-              <w:t>Only</w:t>
-            </w:r>
-            <w:proofErr w:type="spellEnd"/>
-            <w:r>
-              <w:rPr>
-                <w:b/>
-                <w:bCs/>
-                <w:color w:val="FFFFFF"/>
-                <w:sz w:val="20"/>
-                <w:szCs w:val="20"/>
-              </w:rPr>
-              <w:t>)</w:t>
+              <w:t>Carte 2 (Host-Only)</w:t>
             </w:r>
           </w:p>
         </w:tc>
@@ -2584,25 +2377,13 @@
             <w:vAlign w:val="center"/>
           </w:tcPr>
           <w:p>
-            <w:proofErr w:type="spellStart"/>
-            <w:proofErr w:type="gramStart"/>
             <w:r>
               <w:rPr>
                 <w:color w:val="000000"/>
                 <w:sz w:val="19"/>
                 <w:szCs w:val="19"/>
               </w:rPr>
-              <w:t>srv</w:t>
-            </w:r>
-            <w:proofErr w:type="spellEnd"/>
-            <w:proofErr w:type="gramEnd"/>
-            <w:r>
-              <w:rPr>
-                <w:color w:val="000000"/>
-                <w:sz w:val="19"/>
-                <w:szCs w:val="19"/>
-              </w:rPr>
-              <w:t>-monitor</w:t>
+              <w:t>srv-monitor</w:t>
             </w:r>
           </w:p>
         </w:tc>
@@ -2720,23 +2501,13 @@
             <w:vAlign w:val="center"/>
           </w:tcPr>
           <w:p>
-            <w:proofErr w:type="gramStart"/>
             <w:r>
               <w:rPr>
                 <w:color w:val="000000"/>
                 <w:sz w:val="19"/>
                 <w:szCs w:val="19"/>
               </w:rPr>
-              <w:t>srv</w:t>
-            </w:r>
-            <w:proofErr w:type="gramEnd"/>
-            <w:r>
-              <w:rPr>
-                <w:color w:val="000000"/>
-                <w:sz w:val="19"/>
-                <w:szCs w:val="19"/>
-              </w:rPr>
-              <w:t>-web01</w:t>
+              <w:t>srv-web01</w:t>
             </w:r>
           </w:p>
         </w:tc>
@@ -2854,23 +2625,13 @@
             <w:vAlign w:val="center"/>
           </w:tcPr>
           <w:p>
-            <w:proofErr w:type="gramStart"/>
             <w:r>
               <w:rPr>
                 <w:color w:val="000000"/>
                 <w:sz w:val="19"/>
                 <w:szCs w:val="19"/>
               </w:rPr>
-              <w:t>srv</w:t>
-            </w:r>
-            <w:proofErr w:type="gramEnd"/>
-            <w:r>
-              <w:rPr>
-                <w:color w:val="000000"/>
-                <w:sz w:val="19"/>
-                <w:szCs w:val="19"/>
-              </w:rPr>
-              <w:t>-db01</w:t>
+              <w:t>srv-db01</w:t>
             </w:r>
           </w:p>
         </w:tc>
@@ -3078,7 +2839,6 @@
       </w:pPr>
       <w:bookmarkStart w:id="6" w:name="_Toc232510084"/>
       <w:r>
-        <w:lastRenderedPageBreak/>
         <w:t>4. Configuration réseau des machines</w:t>
       </w:r>
       <w:bookmarkEnd w:id="6"/>
@@ -3089,34 +2849,11 @@
         <w:jc w:val="both"/>
       </w:pPr>
       <w:r>
-        <w:t>Sur chaque VM, l’adresse de la seconde interface (Host-</w:t>
-      </w:r>
-      <w:proofErr w:type="spellStart"/>
-      <w:r>
-        <w:t>Only</w:t>
-      </w:r>
-      <w:proofErr w:type="spellEnd"/>
-      <w:r>
-        <w:t xml:space="preserve">) est fixée de façon statique. L’exemple ci-dessous concerne </w:t>
-      </w:r>
-      <w:proofErr w:type="spellStart"/>
-      <w:r>
-        <w:t>srv</w:t>
-      </w:r>
-      <w:proofErr w:type="spellEnd"/>
-      <w:r>
-        <w:t xml:space="preserve">-monitor ; adaptez l’adresse pour srv-web01 (.11) et srv-db01 (.12). Le nom de l’interface peut </w:t>
-      </w:r>
-      <w:r>
-        <w:t xml:space="preserve">varier (enp0s8, enp0s3…) ; vérifiez-le avec la commande « </w:t>
-      </w:r>
-      <w:proofErr w:type="spellStart"/>
-      <w:r>
-        <w:t>ip</w:t>
-      </w:r>
-      <w:proofErr w:type="spellEnd"/>
-      <w:r>
-        <w:t xml:space="preserve"> a ».</w:t>
+        <w:lastRenderedPageBreak/>
+        <w:t xml:space="preserve">Sur chaque VM, l’adresse de la seconde interface (Host-Only) est fixée de façon statique. L’exemple ci-dessous concerne srv-monitor ; adaptez l’adresse pour srv-web01 (.11) et srv-db01 (.12). Le nom de l’interface peut </w:t>
+      </w:r>
+      <w:r>
+        <w:t>varier (enp0s8, enp0s3…) ; vérifiez-le avec la commande « ip a ».</w:t>
       </w:r>
     </w:p>
     <w:tbl>
@@ -3167,8 +2904,6 @@
             <w:pPr>
               <w:spacing w:after="40"/>
             </w:pPr>
-            <w:proofErr w:type="spellStart"/>
-            <w:proofErr w:type="gramStart"/>
             <w:r>
               <w:rPr>
                 <w:rFonts w:ascii="Consolas" w:eastAsia="Consolas" w:hAnsi="Consolas" w:cs="Consolas"/>
@@ -3178,20 +2913,7 @@
                 <w:sz w:val="16"/>
                 <w:szCs w:val="16"/>
               </w:rPr>
-              <w:t>bash</w:t>
-            </w:r>
-            <w:proofErr w:type="spellEnd"/>
-            <w:proofErr w:type="gramEnd"/>
-            <w:r>
-              <w:rPr>
-                <w:rFonts w:ascii="Consolas" w:eastAsia="Consolas" w:hAnsi="Consolas" w:cs="Consolas"/>
-                <w:b/>
-                <w:bCs/>
-                <w:color w:val="7EE787"/>
-                <w:sz w:val="16"/>
-                <w:szCs w:val="16"/>
-              </w:rPr>
-              <w:t xml:space="preserve"> — adresse IP fixe</w:t>
+              <w:t>bash — adresse IP fixe</w:t>
             </w:r>
           </w:p>
           <w:p>
@@ -3202,9 +2924,10 @@
                 <w:sz w:val="17"/>
                 <w:szCs w:val="17"/>
               </w:rPr>
-              <w:t># Fixer l’adresse statique sur l’interface Host-</w:t>
-            </w:r>
-            <w:proofErr w:type="spellStart"/>
+              <w:t># Fixer l’adresse statique sur l’interface Host-Only (srv-monitor)</w:t>
+            </w:r>
+          </w:p>
+          <w:p>
             <w:r>
               <w:rPr>
                 <w:rFonts w:ascii="Consolas" w:eastAsia="Consolas" w:hAnsi="Consolas" w:cs="Consolas"/>
@@ -3212,9 +2935,10 @@
                 <w:sz w:val="17"/>
                 <w:szCs w:val="17"/>
               </w:rPr>
-              <w:t>Only</w:t>
-            </w:r>
-            <w:proofErr w:type="spellEnd"/>
+              <w:t># Fichier : /etc/network/interfaces.d/host-only</w:t>
+            </w:r>
+          </w:p>
+          <w:p>
             <w:r>
               <w:rPr>
                 <w:rFonts w:ascii="Consolas" w:eastAsia="Consolas" w:hAnsi="Consolas" w:cs="Consolas"/>
@@ -3222,9 +2946,10 @@
                 <w:sz w:val="17"/>
                 <w:szCs w:val="17"/>
               </w:rPr>
-              <w:t xml:space="preserve"> (</w:t>
-            </w:r>
-            <w:proofErr w:type="spellStart"/>
+              <w:t>auto enp0s8</w:t>
+            </w:r>
+          </w:p>
+          <w:p>
             <w:r>
               <w:rPr>
                 <w:rFonts w:ascii="Consolas" w:eastAsia="Consolas" w:hAnsi="Consolas" w:cs="Consolas"/>
@@ -3232,9 +2957,10 @@
                 <w:sz w:val="17"/>
                 <w:szCs w:val="17"/>
               </w:rPr>
-              <w:t>srv</w:t>
-            </w:r>
-            <w:proofErr w:type="spellEnd"/>
+              <w:t>iface enp0s8 inet static</w:t>
+            </w:r>
+          </w:p>
+          <w:p>
             <w:r>
               <w:rPr>
                 <w:rFonts w:ascii="Consolas" w:eastAsia="Consolas" w:hAnsi="Consolas" w:cs="Consolas"/>
@@ -3242,10 +2968,8 @@
                 <w:sz w:val="17"/>
                 <w:szCs w:val="17"/>
               </w:rPr>
-              <w:t>-monitor)</w:t>
-            </w:r>
-          </w:p>
-          <w:p>
+              <w:t xml:space="preserve">    address 192</w:t>
+            </w:r>
             <w:r>
               <w:rPr>
                 <w:rFonts w:ascii="Consolas" w:eastAsia="Consolas" w:hAnsi="Consolas" w:cs="Consolas"/>
@@ -3253,9 +2977,10 @@
                 <w:sz w:val="17"/>
                 <w:szCs w:val="17"/>
               </w:rPr>
-              <w:t># Fichier : /</w:t>
-            </w:r>
-            <w:proofErr w:type="spellStart"/>
+              <w:t>.168.56.10      # .11 pour srv-web01, .12 pour srv-db01</w:t>
+            </w:r>
+          </w:p>
+          <w:p>
             <w:r>
               <w:rPr>
                 <w:rFonts w:ascii="Consolas" w:eastAsia="Consolas" w:hAnsi="Consolas" w:cs="Consolas"/>
@@ -3263,202 +2988,7 @@
                 <w:sz w:val="17"/>
                 <w:szCs w:val="17"/>
               </w:rPr>
-              <w:t>etc</w:t>
-            </w:r>
-            <w:proofErr w:type="spellEnd"/>
-            <w:r>
-              <w:rPr>
-                <w:rFonts w:ascii="Consolas" w:eastAsia="Consolas" w:hAnsi="Consolas" w:cs="Consolas"/>
-                <w:color w:val="E6EDF3"/>
-                <w:sz w:val="17"/>
-                <w:szCs w:val="17"/>
-              </w:rPr>
-              <w:t>/network/</w:t>
-            </w:r>
-            <w:proofErr w:type="spellStart"/>
-            <w:proofErr w:type="gramStart"/>
-            <w:r>
-              <w:rPr>
-                <w:rFonts w:ascii="Consolas" w:eastAsia="Consolas" w:hAnsi="Consolas" w:cs="Consolas"/>
-                <w:color w:val="E6EDF3"/>
-                <w:sz w:val="17"/>
-                <w:szCs w:val="17"/>
-              </w:rPr>
-              <w:t>interfaces.d</w:t>
-            </w:r>
-            <w:proofErr w:type="spellEnd"/>
-            <w:proofErr w:type="gramEnd"/>
-            <w:r>
-              <w:rPr>
-                <w:rFonts w:ascii="Consolas" w:eastAsia="Consolas" w:hAnsi="Consolas" w:cs="Consolas"/>
-                <w:color w:val="E6EDF3"/>
-                <w:sz w:val="17"/>
-                <w:szCs w:val="17"/>
-              </w:rPr>
-              <w:t>/host-</w:t>
-            </w:r>
-            <w:proofErr w:type="spellStart"/>
-            <w:r>
-              <w:rPr>
-                <w:rFonts w:ascii="Consolas" w:eastAsia="Consolas" w:hAnsi="Consolas" w:cs="Consolas"/>
-                <w:color w:val="E6EDF3"/>
-                <w:sz w:val="17"/>
-                <w:szCs w:val="17"/>
-              </w:rPr>
-              <w:t>only</w:t>
-            </w:r>
-            <w:proofErr w:type="spellEnd"/>
-          </w:p>
-          <w:p>
-            <w:proofErr w:type="gramStart"/>
-            <w:r>
-              <w:rPr>
-                <w:rFonts w:ascii="Consolas" w:eastAsia="Consolas" w:hAnsi="Consolas" w:cs="Consolas"/>
-                <w:color w:val="E6EDF3"/>
-                <w:sz w:val="17"/>
-                <w:szCs w:val="17"/>
-              </w:rPr>
-              <w:t>auto</w:t>
-            </w:r>
-            <w:proofErr w:type="gramEnd"/>
-            <w:r>
-              <w:rPr>
-                <w:rFonts w:ascii="Consolas" w:eastAsia="Consolas" w:hAnsi="Consolas" w:cs="Consolas"/>
-                <w:color w:val="E6EDF3"/>
-                <w:sz w:val="17"/>
-                <w:szCs w:val="17"/>
-              </w:rPr>
-              <w:t xml:space="preserve"> enp0s8</w:t>
-            </w:r>
-          </w:p>
-          <w:p>
-            <w:proofErr w:type="spellStart"/>
-            <w:proofErr w:type="gramStart"/>
-            <w:r>
-              <w:rPr>
-                <w:rFonts w:ascii="Consolas" w:eastAsia="Consolas" w:hAnsi="Consolas" w:cs="Consolas"/>
-                <w:color w:val="E6EDF3"/>
-                <w:sz w:val="17"/>
-                <w:szCs w:val="17"/>
-              </w:rPr>
-              <w:t>iface</w:t>
-            </w:r>
-            <w:proofErr w:type="spellEnd"/>
-            <w:proofErr w:type="gramEnd"/>
-            <w:r>
-              <w:rPr>
-                <w:rFonts w:ascii="Consolas" w:eastAsia="Consolas" w:hAnsi="Consolas" w:cs="Consolas"/>
-                <w:color w:val="E6EDF3"/>
-                <w:sz w:val="17"/>
-                <w:szCs w:val="17"/>
-              </w:rPr>
-              <w:t xml:space="preserve"> enp0s8 </w:t>
-            </w:r>
-            <w:proofErr w:type="spellStart"/>
-            <w:r>
-              <w:rPr>
-                <w:rFonts w:ascii="Consolas" w:eastAsia="Consolas" w:hAnsi="Consolas" w:cs="Consolas"/>
-                <w:color w:val="E6EDF3"/>
-                <w:sz w:val="17"/>
-                <w:szCs w:val="17"/>
-              </w:rPr>
-              <w:t>inet</w:t>
-            </w:r>
-            <w:proofErr w:type="spellEnd"/>
-            <w:r>
-              <w:rPr>
-                <w:rFonts w:ascii="Consolas" w:eastAsia="Consolas" w:hAnsi="Consolas" w:cs="Consolas"/>
-                <w:color w:val="E6EDF3"/>
-                <w:sz w:val="17"/>
-                <w:szCs w:val="17"/>
-              </w:rPr>
-              <w:t xml:space="preserve"> </w:t>
-            </w:r>
-            <w:proofErr w:type="spellStart"/>
-            <w:r>
-              <w:rPr>
-                <w:rFonts w:ascii="Consolas" w:eastAsia="Consolas" w:hAnsi="Consolas" w:cs="Consolas"/>
-                <w:color w:val="E6EDF3"/>
-                <w:sz w:val="17"/>
-                <w:szCs w:val="17"/>
-              </w:rPr>
-              <w:t>static</w:t>
-            </w:r>
-            <w:proofErr w:type="spellEnd"/>
-          </w:p>
-          <w:p>
-            <w:r>
-              <w:rPr>
-                <w:rFonts w:ascii="Consolas" w:eastAsia="Consolas" w:hAnsi="Consolas" w:cs="Consolas"/>
-                <w:color w:val="E6EDF3"/>
-                <w:sz w:val="17"/>
-                <w:szCs w:val="17"/>
-              </w:rPr>
-              <w:t xml:space="preserve">    </w:t>
-            </w:r>
-            <w:proofErr w:type="spellStart"/>
-            <w:proofErr w:type="gramStart"/>
-            <w:r>
-              <w:rPr>
-                <w:rFonts w:ascii="Consolas" w:eastAsia="Consolas" w:hAnsi="Consolas" w:cs="Consolas"/>
-                <w:color w:val="E6EDF3"/>
-                <w:sz w:val="17"/>
-                <w:szCs w:val="17"/>
-              </w:rPr>
-              <w:t>address</w:t>
-            </w:r>
-            <w:proofErr w:type="spellEnd"/>
-            <w:proofErr w:type="gramEnd"/>
-            <w:r>
-              <w:rPr>
-                <w:rFonts w:ascii="Consolas" w:eastAsia="Consolas" w:hAnsi="Consolas" w:cs="Consolas"/>
-                <w:color w:val="E6EDF3"/>
-                <w:sz w:val="17"/>
-                <w:szCs w:val="17"/>
-              </w:rPr>
-              <w:t xml:space="preserve"> 192</w:t>
-            </w:r>
-            <w:r>
-              <w:rPr>
-                <w:rFonts w:ascii="Consolas" w:eastAsia="Consolas" w:hAnsi="Consolas" w:cs="Consolas"/>
-                <w:color w:val="E6EDF3"/>
-                <w:sz w:val="17"/>
-                <w:szCs w:val="17"/>
-              </w:rPr>
-              <w:t>.168.56.10      # .11 pour srv-web01, .12 pour srv-db01</w:t>
-            </w:r>
-          </w:p>
-          <w:p>
-            <w:r>
-              <w:rPr>
-                <w:rFonts w:ascii="Consolas" w:eastAsia="Consolas" w:hAnsi="Consolas" w:cs="Consolas"/>
-                <w:color w:val="E6EDF3"/>
-                <w:sz w:val="17"/>
-                <w:szCs w:val="17"/>
-              </w:rPr>
-              <w:t xml:space="preserve">    </w:t>
-            </w:r>
-            <w:proofErr w:type="spellStart"/>
-            <w:proofErr w:type="gramStart"/>
-            <w:r>
-              <w:rPr>
-                <w:rFonts w:ascii="Consolas" w:eastAsia="Consolas" w:hAnsi="Consolas" w:cs="Consolas"/>
-                <w:color w:val="E6EDF3"/>
-                <w:sz w:val="17"/>
-                <w:szCs w:val="17"/>
-              </w:rPr>
-              <w:t>netmask</w:t>
-            </w:r>
-            <w:proofErr w:type="spellEnd"/>
-            <w:proofErr w:type="gramEnd"/>
-            <w:r>
-              <w:rPr>
-                <w:rFonts w:ascii="Consolas" w:eastAsia="Consolas" w:hAnsi="Consolas" w:cs="Consolas"/>
-                <w:color w:val="E6EDF3"/>
-                <w:sz w:val="17"/>
-                <w:szCs w:val="17"/>
-              </w:rPr>
-              <w:t xml:space="preserve"> 255.255.255.0</w:t>
+              <w:t xml:space="preserve">    netmask 255.255.255.0</w:t>
             </w:r>
           </w:p>
         </w:tc>
@@ -3521,8 +3051,6 @@
             <w:pPr>
               <w:spacing w:after="40"/>
             </w:pPr>
-            <w:proofErr w:type="spellStart"/>
-            <w:proofErr w:type="gramStart"/>
             <w:r>
               <w:rPr>
                 <w:rFonts w:ascii="Consolas" w:eastAsia="Consolas" w:hAnsi="Consolas" w:cs="Consolas"/>
@@ -3532,20 +3060,7 @@
                 <w:sz w:val="16"/>
                 <w:szCs w:val="16"/>
               </w:rPr>
-              <w:t>bash</w:t>
-            </w:r>
-            <w:proofErr w:type="spellEnd"/>
-            <w:proofErr w:type="gramEnd"/>
-            <w:r>
-              <w:rPr>
-                <w:rFonts w:ascii="Consolas" w:eastAsia="Consolas" w:hAnsi="Consolas" w:cs="Consolas"/>
-                <w:b/>
-                <w:bCs/>
-                <w:color w:val="7EE787"/>
-                <w:sz w:val="16"/>
-                <w:szCs w:val="16"/>
-              </w:rPr>
-              <w:t xml:space="preserve"> — noms d’hôte</w:t>
+              <w:t>bash — noms d’hôte</w:t>
             </w:r>
           </w:p>
           <w:p>
@@ -3576,9 +3091,10 @@
                 <w:sz w:val="17"/>
                 <w:szCs w:val="17"/>
               </w:rPr>
-              <w:t xml:space="preserve"># </w:t>
-            </w:r>
-            <w:proofErr w:type="spellStart"/>
+              <w:t># hostnamectl set-hostname srv-monitor</w:t>
+            </w:r>
+          </w:p>
+          <w:p>
             <w:r>
               <w:rPr>
                 <w:rFonts w:ascii="Consolas" w:eastAsia="Consolas" w:hAnsi="Consolas" w:cs="Consolas"/>
@@ -3586,9 +3102,10 @@
                 <w:sz w:val="17"/>
                 <w:szCs w:val="17"/>
               </w:rPr>
-              <w:t>hostnamectl</w:t>
-            </w:r>
-            <w:proofErr w:type="spellEnd"/>
+              <w:t> </w:t>
+            </w:r>
+          </w:p>
+          <w:p>
             <w:r>
               <w:rPr>
                 <w:rFonts w:ascii="Consolas" w:eastAsia="Consolas" w:hAnsi="Consolas" w:cs="Consolas"/>
@@ -3596,9 +3113,10 @@
                 <w:sz w:val="17"/>
                 <w:szCs w:val="17"/>
               </w:rPr>
-              <w:t xml:space="preserve"> set-</w:t>
-            </w:r>
-            <w:proofErr w:type="spellStart"/>
+              <w:t># /etc/hosts — résolution locale des trois nœuds</w:t>
+            </w:r>
+          </w:p>
+          <w:p>
             <w:r>
               <w:rPr>
                 <w:rFonts w:ascii="Consolas" w:eastAsia="Consolas" w:hAnsi="Consolas" w:cs="Consolas"/>
@@ -3606,110 +3124,7 @@
                 <w:sz w:val="17"/>
                 <w:szCs w:val="17"/>
               </w:rPr>
-              <w:t>hostname</w:t>
-            </w:r>
-            <w:proofErr w:type="spellEnd"/>
-            <w:r>
-              <w:rPr>
-                <w:rFonts w:ascii="Consolas" w:eastAsia="Consolas" w:hAnsi="Consolas" w:cs="Consolas"/>
-                <w:color w:val="E6EDF3"/>
-                <w:sz w:val="17"/>
-                <w:szCs w:val="17"/>
-              </w:rPr>
-              <w:t xml:space="preserve"> </w:t>
-            </w:r>
-            <w:proofErr w:type="spellStart"/>
-            <w:r>
-              <w:rPr>
-                <w:rFonts w:ascii="Consolas" w:eastAsia="Consolas" w:hAnsi="Consolas" w:cs="Consolas"/>
-                <w:color w:val="E6EDF3"/>
-                <w:sz w:val="17"/>
-                <w:szCs w:val="17"/>
-              </w:rPr>
-              <w:t>srv</w:t>
-            </w:r>
-            <w:proofErr w:type="spellEnd"/>
-            <w:r>
-              <w:rPr>
-                <w:rFonts w:ascii="Consolas" w:eastAsia="Consolas" w:hAnsi="Consolas" w:cs="Consolas"/>
-                <w:color w:val="E6EDF3"/>
-                <w:sz w:val="17"/>
-                <w:szCs w:val="17"/>
-              </w:rPr>
-              <w:t>-monitor</w:t>
-            </w:r>
-          </w:p>
-          <w:p>
-            <w:r>
-              <w:rPr>
-                <w:rFonts w:ascii="Consolas" w:eastAsia="Consolas" w:hAnsi="Consolas" w:cs="Consolas"/>
-                <w:color w:val="E6EDF3"/>
-                <w:sz w:val="17"/>
-                <w:szCs w:val="17"/>
-              </w:rPr>
-              <w:t> </w:t>
-            </w:r>
-          </w:p>
-          <w:p>
-            <w:r>
-              <w:rPr>
-                <w:rFonts w:ascii="Consolas" w:eastAsia="Consolas" w:hAnsi="Consolas" w:cs="Consolas"/>
-                <w:color w:val="E6EDF3"/>
-                <w:sz w:val="17"/>
-                <w:szCs w:val="17"/>
-              </w:rPr>
-              <w:t># /</w:t>
-            </w:r>
-            <w:proofErr w:type="spellStart"/>
-            <w:r>
-              <w:rPr>
-                <w:rFonts w:ascii="Consolas" w:eastAsia="Consolas" w:hAnsi="Consolas" w:cs="Consolas"/>
-                <w:color w:val="E6EDF3"/>
-                <w:sz w:val="17"/>
-                <w:szCs w:val="17"/>
-              </w:rPr>
-              <w:t>etc</w:t>
-            </w:r>
-            <w:proofErr w:type="spellEnd"/>
-            <w:r>
-              <w:rPr>
-                <w:rFonts w:ascii="Consolas" w:eastAsia="Consolas" w:hAnsi="Consolas" w:cs="Consolas"/>
-                <w:color w:val="E6EDF3"/>
-                <w:sz w:val="17"/>
-                <w:szCs w:val="17"/>
-              </w:rPr>
-              <w:t>/hosts — résolution locale des trois nœuds</w:t>
-            </w:r>
-          </w:p>
-          <w:p>
-            <w:r>
-              <w:rPr>
-                <w:rFonts w:ascii="Consolas" w:eastAsia="Consolas" w:hAnsi="Consolas" w:cs="Consolas"/>
-                <w:color w:val="E6EDF3"/>
-                <w:sz w:val="17"/>
-                <w:szCs w:val="17"/>
-              </w:rPr>
-              <w:t xml:space="preserve">192.168.56.10   </w:t>
-            </w:r>
-            <w:proofErr w:type="spellStart"/>
-            <w:r>
-              <w:rPr>
-                <w:rFonts w:ascii="Consolas" w:eastAsia="Consolas" w:hAnsi="Consolas" w:cs="Consolas"/>
-                <w:color w:val="E6EDF3"/>
-                <w:sz w:val="17"/>
-                <w:szCs w:val="17"/>
-              </w:rPr>
-              <w:t>srv</w:t>
-            </w:r>
-            <w:proofErr w:type="spellEnd"/>
-            <w:r>
-              <w:rPr>
-                <w:rFonts w:ascii="Consolas" w:eastAsia="Consolas" w:hAnsi="Consolas" w:cs="Consolas"/>
-                <w:color w:val="E6EDF3"/>
-                <w:sz w:val="17"/>
-                <w:szCs w:val="17"/>
-              </w:rPr>
-              <w:t>-monitor</w:t>
+              <w:t>192.168.56.10   srv-monitor</w:t>
             </w:r>
           </w:p>
           <w:p>
@@ -3799,7 +3214,6 @@
               <w:spacing w:after="60"/>
               <w:jc w:val="center"/>
             </w:pPr>
-            <w:proofErr w:type="gramStart"/>
             <w:r>
               <w:rPr>
                 <w:b/>
@@ -3818,18 +3232,7 @@
                 <w:sz w:val="21"/>
                 <w:szCs w:val="21"/>
               </w:rPr>
-              <w:t xml:space="preserve">  Capture</w:t>
-            </w:r>
-            <w:proofErr w:type="gramEnd"/>
-            <w:r>
-              <w:rPr>
-                <w:b/>
-                <w:bCs/>
-                <w:color w:val="1F3A5F"/>
-                <w:sz w:val="21"/>
-                <w:szCs w:val="21"/>
-              </w:rPr>
-              <w:t xml:space="preserve"> 2 — Connectivité entre les nœuds</w:t>
+              <w:t xml:space="preserve">  Capture 2 — Connectivité entre les nœuds</w:t>
             </w:r>
           </w:p>
           <w:p>
@@ -3845,52 +3248,20 @@
                 <w:sz w:val="19"/>
                 <w:szCs w:val="19"/>
               </w:rPr>
-              <w:t xml:space="preserve">Capturer un terminal montrant un ping réussi de </w:t>
-            </w:r>
-            <w:proofErr w:type="spellStart"/>
-            <w:r>
-              <w:rPr>
-                <w:i/>
-                <w:iCs/>
-                <w:color w:val="555555"/>
-                <w:sz w:val="19"/>
-                <w:szCs w:val="19"/>
-              </w:rPr>
-              <w:t>srv</w:t>
-            </w:r>
-            <w:proofErr w:type="spellEnd"/>
-            <w:r>
-              <w:rPr>
-                <w:i/>
-                <w:iCs/>
-                <w:color w:val="555555"/>
-                <w:sz w:val="19"/>
-                <w:szCs w:val="19"/>
-              </w:rPr>
-              <w:t>-monitor vers srv-web01 et srv-db01.</w:t>
+              <w:t>Capturer un terminal montrant un ping réussi de srv-monitor vers srv-web01 et srv-db01.</w:t>
             </w:r>
           </w:p>
           <w:p>
             <w:pPr>
               <w:jc w:val="center"/>
             </w:pPr>
-            <w:proofErr w:type="gramStart"/>
             <w:r>
               <w:rPr>
                 <w:color w:val="9DB8D2"/>
                 <w:sz w:val="18"/>
                 <w:szCs w:val="18"/>
               </w:rPr>
-              <w:t>[ Insérer</w:t>
-            </w:r>
-            <w:proofErr w:type="gramEnd"/>
-            <w:r>
-              <w:rPr>
-                <w:color w:val="9DB8D2"/>
-                <w:sz w:val="18"/>
-                <w:szCs w:val="18"/>
-              </w:rPr>
-              <w:t xml:space="preserve"> la capture d’écran ici ]</w:t>
+              <w:t>[ Insérer la capture d’écran ici ]</w:t>
             </w:r>
           </w:p>
         </w:tc>
@@ -3902,15 +3273,7 @@
       </w:pPr>
       <w:bookmarkStart w:id="7" w:name="_Toc232510085"/>
       <w:r>
-        <w:t>5. Déploiement du serveur de supervision (</w:t>
-      </w:r>
-      <w:proofErr w:type="spellStart"/>
-      <w:r>
-        <w:t>srv</w:t>
-      </w:r>
-      <w:proofErr w:type="spellEnd"/>
-      <w:r>
-        <w:t>-monitor)</w:t>
+        <w:t>5. Déploiement du serveur de supervision (srv-monitor)</w:t>
       </w:r>
       <w:bookmarkEnd w:id="7"/>
     </w:p>
@@ -3920,39 +3283,7 @@
         <w:jc w:val="both"/>
       </w:pPr>
       <w:r>
-        <w:t xml:space="preserve">Le serveur </w:t>
-      </w:r>
-      <w:proofErr w:type="spellStart"/>
-      <w:r>
-        <w:t>srv</w:t>
-      </w:r>
-      <w:proofErr w:type="spellEnd"/>
-      <w:r>
-        <w:t xml:space="preserve">-monitor accueille </w:t>
-      </w:r>
-      <w:proofErr w:type="spellStart"/>
-      <w:r>
-        <w:t>Prometheus</w:t>
-      </w:r>
-      <w:proofErr w:type="spellEnd"/>
-      <w:r>
-        <w:t xml:space="preserve">, </w:t>
-      </w:r>
-      <w:proofErr w:type="spellStart"/>
-      <w:r>
-        <w:t>AlertManager</w:t>
-      </w:r>
-      <w:proofErr w:type="spellEnd"/>
-      <w:r>
-        <w:t xml:space="preserve">, </w:t>
-      </w:r>
-      <w:proofErr w:type="spellStart"/>
-      <w:r>
-        <w:t>Grafana</w:t>
-      </w:r>
-      <w:proofErr w:type="spellEnd"/>
-      <w:r>
-        <w:t xml:space="preserve"> et son pro</w:t>
+        <w:t>Le serveur srv-monitor accueille Prometheus, AlertManager, Grafana et son pro</w:t>
       </w:r>
       <w:r>
         <w:t>pre Node Exporter. Les scripts fournis automatisent ces installations. Transférez d’abord le dossier du projet sur la VM, puis exécutez les scripts dans l’ordre indiqué.</w:t>
@@ -3964,22 +3295,9 @@
       </w:pPr>
       <w:bookmarkStart w:id="8" w:name="_Toc232510086"/>
       <w:r>
-        <w:t xml:space="preserve">5.1. </w:t>
-      </w:r>
-      <w:proofErr w:type="spellStart"/>
-      <w:r>
-        <w:t>Prometheus</w:t>
-      </w:r>
-      <w:proofErr w:type="spellEnd"/>
-      <w:r>
-        <w:t xml:space="preserve"> et </w:t>
-      </w:r>
-      <w:proofErr w:type="spellStart"/>
-      <w:r>
-        <w:t>AlertManager</w:t>
+        <w:t>5.1. Prometheus et AlertManager</w:t>
       </w:r>
       <w:bookmarkEnd w:id="8"/>
-      <w:proofErr w:type="spellEnd"/>
     </w:p>
     <w:p>
       <w:pPr>
@@ -3987,42 +3305,10 @@
         <w:jc w:val="both"/>
       </w:pPr>
       <w:r>
-        <w:t xml:space="preserve">Le script install_prometheus.sh télécharge </w:t>
-      </w:r>
-      <w:proofErr w:type="spellStart"/>
-      <w:r>
-        <w:t>Prometheus</w:t>
-      </w:r>
-      <w:proofErr w:type="spellEnd"/>
-      <w:r>
-        <w:t xml:space="preserve"> </w:t>
-      </w:r>
-      <w:r>
-        <w:t xml:space="preserve">2.53 LTS et </w:t>
-      </w:r>
-      <w:proofErr w:type="spellStart"/>
-      <w:r>
-        <w:t>AlertManager</w:t>
-      </w:r>
-      <w:proofErr w:type="spellEnd"/>
-      <w:r>
-        <w:t xml:space="preserve"> 0.27, crée les comptes de service dédiés, met en place les fichiers de configuration et les unités </w:t>
-      </w:r>
-      <w:proofErr w:type="spellStart"/>
-      <w:r>
-        <w:t>systemd</w:t>
-      </w:r>
-      <w:proofErr w:type="spellEnd"/>
-      <w:r>
-        <w:t xml:space="preserve">, puis vérifie la validité des règles avec </w:t>
-      </w:r>
-      <w:proofErr w:type="spellStart"/>
-      <w:r>
-        <w:t>promtool</w:t>
-      </w:r>
-      <w:proofErr w:type="spellEnd"/>
-      <w:r>
-        <w:t>.</w:t>
+        <w:t xml:space="preserve">Le script install_prometheus.sh télécharge Prometheus </w:t>
+      </w:r>
+      <w:r>
+        <w:t>2.53 LTS et AlertManager 0.27, crée les comptes de service dédiés, met en place les fichiers de configuration et les unités systemd, puis vérifie la validité des règles avec promtool.</w:t>
       </w:r>
     </w:p>
     <w:tbl>
@@ -4073,8 +3359,6 @@
             <w:pPr>
               <w:spacing w:after="40"/>
             </w:pPr>
-            <w:proofErr w:type="spellStart"/>
-            <w:proofErr w:type="gramStart"/>
             <w:r>
               <w:rPr>
                 <w:rFonts w:ascii="Consolas" w:eastAsia="Consolas" w:hAnsi="Consolas" w:cs="Consolas"/>
@@ -4086,8 +3370,6 @@
               </w:rPr>
               <w:t>bash</w:t>
             </w:r>
-            <w:proofErr w:type="spellEnd"/>
-            <w:proofErr w:type="gramEnd"/>
           </w:p>
           <w:p>
             <w:r>
@@ -4097,9 +3379,10 @@
                 <w:sz w:val="17"/>
                 <w:szCs w:val="17"/>
               </w:rPr>
-              <w:t xml:space="preserve"># Sur </w:t>
-            </w:r>
-            <w:proofErr w:type="spellStart"/>
+              <w:t># Sur srv-monitor, depuis le dossier du projet</w:t>
+            </w:r>
+          </w:p>
+          <w:p>
             <w:r>
               <w:rPr>
                 <w:rFonts w:ascii="Consolas" w:eastAsia="Consolas" w:hAnsi="Consolas" w:cs="Consolas"/>
@@ -4107,9 +3390,10 @@
                 <w:sz w:val="17"/>
                 <w:szCs w:val="17"/>
               </w:rPr>
-              <w:t>srv</w:t>
-            </w:r>
-            <w:proofErr w:type="spellEnd"/>
+              <w:t>$ cd projet01-monitoring</w:t>
+            </w:r>
+          </w:p>
+          <w:p>
             <w:r>
               <w:rPr>
                 <w:rFonts w:ascii="Consolas" w:eastAsia="Consolas" w:hAnsi="Consolas" w:cs="Consolas"/>
@@ -4117,7 +3401,7 @@
                 <w:sz w:val="17"/>
                 <w:szCs w:val="17"/>
               </w:rPr>
-              <w:t>-monitor, depuis le dossier du projet</w:t>
+              <w:t>$ sudo bash scripts/install_prometheus.sh</w:t>
             </w:r>
           </w:p>
           <w:p>
@@ -4128,7 +3412,7 @@
                 <w:sz w:val="17"/>
                 <w:szCs w:val="17"/>
               </w:rPr>
-              <w:t>$ cd projet01-monitoring</w:t>
+              <w:t> </w:t>
             </w:r>
           </w:p>
           <w:p>
@@ -4139,9 +3423,10 @@
                 <w:sz w:val="17"/>
                 <w:szCs w:val="17"/>
               </w:rPr>
-              <w:t xml:space="preserve">$ </w:t>
-            </w:r>
-            <w:proofErr w:type="spellStart"/>
+              <w:t># Vérifier que les services sont actifs</w:t>
+            </w:r>
+          </w:p>
+          <w:p>
             <w:r>
               <w:rPr>
                 <w:rFonts w:ascii="Consolas" w:eastAsia="Consolas" w:hAnsi="Consolas" w:cs="Consolas"/>
@@ -4149,143 +3434,9 @@
                 <w:sz w:val="17"/>
                 <w:szCs w:val="17"/>
               </w:rPr>
-              <w:t>sudo</w:t>
-            </w:r>
-            <w:proofErr w:type="spellEnd"/>
-            <w:r>
-              <w:rPr>
-                <w:rFonts w:ascii="Consolas" w:eastAsia="Consolas" w:hAnsi="Consolas" w:cs="Consolas"/>
-                <w:color w:val="E6EDF3"/>
-                <w:sz w:val="17"/>
-                <w:szCs w:val="17"/>
-              </w:rPr>
-              <w:t xml:space="preserve"> </w:t>
-            </w:r>
-            <w:proofErr w:type="spellStart"/>
-            <w:r>
-              <w:rPr>
-                <w:rFonts w:ascii="Consolas" w:eastAsia="Consolas" w:hAnsi="Consolas" w:cs="Consolas"/>
-                <w:color w:val="E6EDF3"/>
-                <w:sz w:val="17"/>
-                <w:szCs w:val="17"/>
-              </w:rPr>
-              <w:t>bash</w:t>
-            </w:r>
-            <w:proofErr w:type="spellEnd"/>
-            <w:r>
-              <w:rPr>
-                <w:rFonts w:ascii="Consolas" w:eastAsia="Consolas" w:hAnsi="Consolas" w:cs="Consolas"/>
-                <w:color w:val="E6EDF3"/>
-                <w:sz w:val="17"/>
-                <w:szCs w:val="17"/>
-              </w:rPr>
-              <w:t xml:space="preserve"> scripts/install_prometheus.sh</w:t>
-            </w:r>
-          </w:p>
-          <w:p>
-            <w:r>
-              <w:rPr>
-                <w:rFonts w:ascii="Consolas" w:eastAsia="Consolas" w:hAnsi="Consolas" w:cs="Consolas"/>
-                <w:color w:val="E6EDF3"/>
-                <w:sz w:val="17"/>
-                <w:szCs w:val="17"/>
-              </w:rPr>
               <w:lastRenderedPageBreak/>
-              <w:t> </w:t>
-            </w:r>
-          </w:p>
-          <w:p>
-            <w:r>
-              <w:rPr>
-                <w:rFonts w:ascii="Consolas" w:eastAsia="Consolas" w:hAnsi="Consolas" w:cs="Consolas"/>
-                <w:color w:val="E6EDF3"/>
-                <w:sz w:val="17"/>
-                <w:szCs w:val="17"/>
-              </w:rPr>
-              <w:t># Vérifier que les services sont actifs</w:t>
-            </w:r>
-          </w:p>
-          <w:p>
-            <w:r>
-              <w:rPr>
-                <w:rFonts w:ascii="Consolas" w:eastAsia="Consolas" w:hAnsi="Consolas" w:cs="Consolas"/>
-                <w:color w:val="E6EDF3"/>
-                <w:sz w:val="17"/>
-                <w:szCs w:val="17"/>
-              </w:rPr>
-              <w:t xml:space="preserve">$ </w:t>
-            </w:r>
-            <w:proofErr w:type="spellStart"/>
-            <w:r>
-              <w:rPr>
-                <w:rFonts w:ascii="Consolas" w:eastAsia="Consolas" w:hAnsi="Consolas" w:cs="Consolas"/>
-                <w:color w:val="E6EDF3"/>
-                <w:sz w:val="17"/>
-                <w:szCs w:val="17"/>
-              </w:rPr>
-              <w:t>systemctl</w:t>
-            </w:r>
-            <w:proofErr w:type="spellEnd"/>
-            <w:r>
-              <w:rPr>
-                <w:rFonts w:ascii="Consolas" w:eastAsia="Consolas" w:hAnsi="Consolas" w:cs="Consolas"/>
-                <w:color w:val="E6EDF3"/>
-                <w:sz w:val="17"/>
-                <w:szCs w:val="17"/>
-              </w:rPr>
-              <w:t xml:space="preserve"> </w:t>
-            </w:r>
-            <w:proofErr w:type="spellStart"/>
-            <w:r>
-              <w:rPr>
-                <w:rFonts w:ascii="Consolas" w:eastAsia="Consolas" w:hAnsi="Consolas" w:cs="Consolas"/>
-                <w:color w:val="E6EDF3"/>
-                <w:sz w:val="17"/>
-                <w:szCs w:val="17"/>
-              </w:rPr>
-              <w:t>status</w:t>
-            </w:r>
-            <w:proofErr w:type="spellEnd"/>
-            <w:r>
-              <w:rPr>
-                <w:rFonts w:ascii="Consolas" w:eastAsia="Consolas" w:hAnsi="Consolas" w:cs="Consolas"/>
-                <w:color w:val="E6EDF3"/>
-                <w:sz w:val="17"/>
-                <w:szCs w:val="17"/>
-              </w:rPr>
-              <w:t xml:space="preserve"> </w:t>
-            </w:r>
-            <w:proofErr w:type="spellStart"/>
-            <w:r>
-              <w:rPr>
-                <w:rFonts w:ascii="Consolas" w:eastAsia="Consolas" w:hAnsi="Consolas" w:cs="Consolas"/>
-                <w:color w:val="E6EDF3"/>
-                <w:sz w:val="17"/>
-                <w:szCs w:val="17"/>
-              </w:rPr>
-              <w:t>prometheus</w:t>
-            </w:r>
-            <w:proofErr w:type="spellEnd"/>
-            <w:r>
-              <w:rPr>
-                <w:rFonts w:ascii="Consolas" w:eastAsia="Consolas" w:hAnsi="Consolas" w:cs="Consolas"/>
-                <w:color w:val="E6EDF3"/>
-                <w:sz w:val="17"/>
-                <w:szCs w:val="17"/>
-              </w:rPr>
-              <w:t xml:space="preserve"> </w:t>
-            </w:r>
-            <w:proofErr w:type="spellStart"/>
-            <w:r>
-              <w:rPr>
-                <w:rFonts w:ascii="Consolas" w:eastAsia="Consolas" w:hAnsi="Consolas" w:cs="Consolas"/>
-                <w:color w:val="E6EDF3"/>
-                <w:sz w:val="17"/>
-                <w:szCs w:val="17"/>
-              </w:rPr>
-              <w:t>alertmanager</w:t>
-            </w:r>
-            <w:proofErr w:type="spellEnd"/>
+              <w:t>$ systemctl status prometheus alertmanager</w:t>
+            </w:r>
           </w:p>
         </w:tc>
       </w:tr>
@@ -4297,34 +3448,10 @@
       </w:pPr>
       <w:r>
         <w:lastRenderedPageBreak/>
-        <w:t xml:space="preserve">Une fois le service démarré, l’interface de </w:t>
-      </w:r>
-      <w:proofErr w:type="spellStart"/>
-      <w:r>
-        <w:t>Prometheus</w:t>
-      </w:r>
-      <w:proofErr w:type="spellEnd"/>
-      <w:r>
-        <w:t xml:space="preserve"> e</w:t>
-      </w:r>
-      <w:r>
-        <w:t xml:space="preserve">st accessible depuis le navigateur de l’hôte Windows à l’adresse http://192.168.56.10:9090. La page « </w:t>
-      </w:r>
-      <w:proofErr w:type="spellStart"/>
-      <w:r>
-        <w:t>Status</w:t>
-      </w:r>
-      <w:proofErr w:type="spellEnd"/>
-      <w:r>
-        <w:t xml:space="preserve"> → </w:t>
-      </w:r>
-      <w:proofErr w:type="spellStart"/>
-      <w:r>
-        <w:t>Targets</w:t>
-      </w:r>
-      <w:proofErr w:type="spellEnd"/>
-      <w:r>
-        <w:t xml:space="preserve"> » doit montrer les cibles surveillées.</w:t>
+        <w:t>Une fois le service démarré, l’interface de Prometheus e</w:t>
+      </w:r>
+      <w:r>
+        <w:t>st accessible depuis le navigateur de l’hôte Windows à l’adresse http://192.168.56.10:9090. La page « Status → Targets » doit montrer les cibles surveillées.</w:t>
       </w:r>
     </w:p>
     <w:tbl>
@@ -4377,7 +3504,6 @@
               <w:spacing w:after="60"/>
               <w:jc w:val="center"/>
             </w:pPr>
-            <w:proofErr w:type="gramStart"/>
             <w:r>
               <w:rPr>
                 <w:b/>
@@ -4396,31 +3522,8 @@
                 <w:sz w:val="21"/>
                 <w:szCs w:val="21"/>
               </w:rPr>
-              <w:t xml:space="preserve">  Capture</w:t>
-            </w:r>
-            <w:proofErr w:type="gramEnd"/>
-            <w:r>
-              <w:rPr>
-                <w:b/>
-                <w:bCs/>
-                <w:color w:val="1F3A5F"/>
-                <w:sz w:val="21"/>
-                <w:szCs w:val="21"/>
-              </w:rPr>
-              <w:t xml:space="preserve"> 3 — Cibles </w:t>
-            </w:r>
-            <w:proofErr w:type="spellStart"/>
-            <w:r>
-              <w:rPr>
-                <w:b/>
-                <w:bCs/>
-                <w:color w:val="1F3A5F"/>
-                <w:sz w:val="21"/>
-                <w:szCs w:val="21"/>
-              </w:rPr>
-              <w:t>Prometheus</w:t>
-            </w:r>
-            <w:proofErr w:type="spellEnd"/>
+              <w:t xml:space="preserve">  Capture 3 — Cibles Prometheus</w:t>
+            </w:r>
           </w:p>
           <w:p>
             <w:pPr>
@@ -4435,96 +3538,20 @@
                 <w:sz w:val="19"/>
                 <w:szCs w:val="19"/>
               </w:rPr>
-              <w:t xml:space="preserve">Capturer la page </w:t>
-            </w:r>
-            <w:proofErr w:type="spellStart"/>
-            <w:r>
-              <w:rPr>
-                <w:i/>
-                <w:iCs/>
-                <w:color w:val="555555"/>
-                <w:sz w:val="19"/>
-                <w:szCs w:val="19"/>
-              </w:rPr>
-              <w:t>Status</w:t>
-            </w:r>
-            <w:proofErr w:type="spellEnd"/>
-            <w:r>
-              <w:rPr>
-                <w:i/>
-                <w:iCs/>
-                <w:color w:val="555555"/>
-                <w:sz w:val="19"/>
-                <w:szCs w:val="19"/>
-              </w:rPr>
-              <w:t xml:space="preserve"> → </w:t>
-            </w:r>
-            <w:proofErr w:type="spellStart"/>
-            <w:r>
-              <w:rPr>
-                <w:i/>
-                <w:iCs/>
-                <w:color w:val="555555"/>
-                <w:sz w:val="19"/>
-                <w:szCs w:val="19"/>
-              </w:rPr>
-              <w:t>Targets</w:t>
-            </w:r>
-            <w:proofErr w:type="spellEnd"/>
-            <w:r>
-              <w:rPr>
-                <w:i/>
-                <w:iCs/>
-                <w:color w:val="555555"/>
-                <w:sz w:val="19"/>
-                <w:szCs w:val="19"/>
-              </w:rPr>
-              <w:t xml:space="preserve"> de </w:t>
-            </w:r>
-            <w:proofErr w:type="spellStart"/>
-            <w:r>
-              <w:rPr>
-                <w:i/>
-                <w:iCs/>
-                <w:color w:val="555555"/>
-                <w:sz w:val="19"/>
-                <w:szCs w:val="19"/>
-              </w:rPr>
-              <w:t>Prometheus</w:t>
-            </w:r>
-            <w:proofErr w:type="spellEnd"/>
-            <w:r>
-              <w:rPr>
-                <w:i/>
-                <w:iCs/>
-                <w:color w:val="555555"/>
-                <w:sz w:val="19"/>
-                <w:szCs w:val="19"/>
-              </w:rPr>
-              <w:t>, montrant les cibles à l’état UP.</w:t>
+              <w:t>Capturer la page Status → Targets de Prometheus, montrant les cibles à l’état UP.</w:t>
             </w:r>
           </w:p>
           <w:p>
             <w:pPr>
               <w:jc w:val="center"/>
             </w:pPr>
-            <w:proofErr w:type="gramStart"/>
             <w:r>
               <w:rPr>
                 <w:color w:val="9DB8D2"/>
                 <w:sz w:val="18"/>
                 <w:szCs w:val="18"/>
               </w:rPr>
-              <w:t>[ Insérer</w:t>
-            </w:r>
-            <w:proofErr w:type="gramEnd"/>
-            <w:r>
-              <w:rPr>
-                <w:color w:val="9DB8D2"/>
-                <w:sz w:val="18"/>
-                <w:szCs w:val="18"/>
-              </w:rPr>
-              <w:t xml:space="preserve"> la capture d’écran ici ]</w:t>
+              <w:t>[ Insérer la capture d’écran ici ]</w:t>
             </w:r>
           </w:p>
         </w:tc>
@@ -4551,23 +3578,7 @@
         <w:jc w:val="both"/>
       </w:pPr>
       <w:r>
-        <w:t xml:space="preserve">Le script install_node_exporter.sh installe Node Exporter 1.8.2 en tant que service </w:t>
-      </w:r>
-      <w:proofErr w:type="spellStart"/>
-      <w:r>
-        <w:t>systemd</w:t>
-      </w:r>
-      <w:proofErr w:type="spellEnd"/>
-      <w:r>
-        <w:t xml:space="preserve"> durci, sous un compte sans privilège. Il est à exécuter sur les trois VM ; commencez par </w:t>
-      </w:r>
-      <w:proofErr w:type="spellStart"/>
-      <w:r>
-        <w:t>srv</w:t>
-      </w:r>
-      <w:proofErr w:type="spellEnd"/>
-      <w:r>
-        <w:t>-monitor.</w:t>
+        <w:t>Le script install_node_exporter.sh installe Node Exporter 1.8.2 en tant que service systemd durci, sous un compte sans privilège. Il est à exécuter sur les trois VM ; commencez par srv-monitor.</w:t>
       </w:r>
     </w:p>
     <w:tbl>
@@ -4618,8 +3629,6 @@
             <w:pPr>
               <w:spacing w:after="40"/>
             </w:pPr>
-            <w:proofErr w:type="spellStart"/>
-            <w:proofErr w:type="gramStart"/>
             <w:r>
               <w:rPr>
                 <w:rFonts w:ascii="Consolas" w:eastAsia="Consolas" w:hAnsi="Consolas" w:cs="Consolas"/>
@@ -4631,8 +3640,6 @@
               </w:rPr>
               <w:t>bash</w:t>
             </w:r>
-            <w:proofErr w:type="spellEnd"/>
-            <w:proofErr w:type="gramEnd"/>
           </w:p>
           <w:p>
             <w:r>
@@ -4653,9 +3660,8 @@
                 <w:sz w:val="17"/>
                 <w:szCs w:val="17"/>
               </w:rPr>
-              <w:t xml:space="preserve">$ </w:t>
-            </w:r>
-            <w:proofErr w:type="spellStart"/>
+              <w:t>$ sudo bash scripts</w:t>
+            </w:r>
             <w:r>
               <w:rPr>
                 <w:rFonts w:ascii="Consolas" w:eastAsia="Consolas" w:hAnsi="Consolas" w:cs="Consolas"/>
@@ -4663,9 +3669,10 @@
                 <w:sz w:val="17"/>
                 <w:szCs w:val="17"/>
               </w:rPr>
-              <w:t>sudo</w:t>
-            </w:r>
-            <w:proofErr w:type="spellEnd"/>
+              <w:t>/install_node_exporter.sh</w:t>
+            </w:r>
+          </w:p>
+          <w:p>
             <w:r>
               <w:rPr>
                 <w:rFonts w:ascii="Consolas" w:eastAsia="Consolas" w:hAnsi="Consolas" w:cs="Consolas"/>
@@ -4673,9 +3680,10 @@
                 <w:sz w:val="17"/>
                 <w:szCs w:val="17"/>
               </w:rPr>
-              <w:t xml:space="preserve"> </w:t>
-            </w:r>
-            <w:proofErr w:type="spellStart"/>
+              <w:t> </w:t>
+            </w:r>
+          </w:p>
+          <w:p>
             <w:r>
               <w:rPr>
                 <w:rFonts w:ascii="Consolas" w:eastAsia="Consolas" w:hAnsi="Consolas" w:cs="Consolas"/>
@@ -4683,9 +3691,10 @@
                 <w:sz w:val="17"/>
                 <w:szCs w:val="17"/>
               </w:rPr>
-              <w:t>bash</w:t>
-            </w:r>
-            <w:proofErr w:type="spellEnd"/>
+              <w:t># Contrôler l’exposition des métriques</w:t>
+            </w:r>
+          </w:p>
+          <w:p>
             <w:r>
               <w:rPr>
                 <w:rFonts w:ascii="Consolas" w:eastAsia="Consolas" w:hAnsi="Consolas" w:cs="Consolas"/>
@@ -4693,121 +3702,8 @@
                 <w:sz w:val="17"/>
                 <w:szCs w:val="17"/>
               </w:rPr>
-              <w:t xml:space="preserve"> scripts</w:t>
-            </w:r>
-            <w:r>
-              <w:rPr>
-                <w:rFonts w:ascii="Consolas" w:eastAsia="Consolas" w:hAnsi="Consolas" w:cs="Consolas"/>
-                <w:color w:val="E6EDF3"/>
-                <w:sz w:val="17"/>
-                <w:szCs w:val="17"/>
-              </w:rPr>
-              <w:t>/install_node_exporter.sh</w:t>
-            </w:r>
-          </w:p>
-          <w:p>
-            <w:r>
-              <w:rPr>
-                <w:rFonts w:ascii="Consolas" w:eastAsia="Consolas" w:hAnsi="Consolas" w:cs="Consolas"/>
-                <w:color w:val="E6EDF3"/>
-                <w:sz w:val="17"/>
-                <w:szCs w:val="17"/>
-              </w:rPr>
-              <w:t> </w:t>
-            </w:r>
-          </w:p>
-          <w:p>
-            <w:r>
-              <w:rPr>
-                <w:rFonts w:ascii="Consolas" w:eastAsia="Consolas" w:hAnsi="Consolas" w:cs="Consolas"/>
-                <w:color w:val="E6EDF3"/>
-                <w:sz w:val="17"/>
-                <w:szCs w:val="17"/>
-              </w:rPr>
-              <w:t># Contrôler l’exposition des métriques</w:t>
-            </w:r>
-          </w:p>
-          <w:p>
-            <w:r>
-              <w:rPr>
-                <w:rFonts w:ascii="Consolas" w:eastAsia="Consolas" w:hAnsi="Consolas" w:cs="Consolas"/>
-                <w:color w:val="E6EDF3"/>
-                <w:sz w:val="17"/>
-                <w:szCs w:val="17"/>
-              </w:rPr>
-              <w:t xml:space="preserve">$ </w:t>
-            </w:r>
-            <w:proofErr w:type="spellStart"/>
-            <w:r>
-              <w:rPr>
-                <w:rFonts w:ascii="Consolas" w:eastAsia="Consolas" w:hAnsi="Consolas" w:cs="Consolas"/>
-                <w:color w:val="E6EDF3"/>
-                <w:sz w:val="17"/>
-                <w:szCs w:val="17"/>
-              </w:rPr>
-              <w:t>curl</w:t>
-            </w:r>
-            <w:proofErr w:type="spellEnd"/>
-            <w:r>
-              <w:rPr>
-                <w:rFonts w:ascii="Consolas" w:eastAsia="Consolas" w:hAnsi="Consolas" w:cs="Consolas"/>
-                <w:color w:val="E6EDF3"/>
-                <w:sz w:val="17"/>
-                <w:szCs w:val="17"/>
-              </w:rPr>
-              <w:t xml:space="preserve"> -s </w:t>
-            </w:r>
-            <w:proofErr w:type="gramStart"/>
-            <w:r>
-              <w:rPr>
-                <w:rFonts w:ascii="Consolas" w:eastAsia="Consolas" w:hAnsi="Consolas" w:cs="Consolas"/>
-                <w:color w:val="E6EDF3"/>
-                <w:sz w:val="17"/>
-                <w:szCs w:val="17"/>
-              </w:rPr>
-              <w:t>localhost:</w:t>
-            </w:r>
-            <w:proofErr w:type="gramEnd"/>
-            <w:r>
-              <w:rPr>
-                <w:rFonts w:ascii="Consolas" w:eastAsia="Consolas" w:hAnsi="Consolas" w:cs="Consolas"/>
-                <w:color w:val="E6EDF3"/>
-                <w:sz w:val="17"/>
-                <w:szCs w:val="17"/>
-              </w:rPr>
-              <w:t>9100/</w:t>
-            </w:r>
-            <w:proofErr w:type="spellStart"/>
-            <w:r>
-              <w:rPr>
-                <w:rFonts w:ascii="Consolas" w:eastAsia="Consolas" w:hAnsi="Consolas" w:cs="Consolas"/>
-                <w:color w:val="E6EDF3"/>
-                <w:sz w:val="17"/>
-                <w:szCs w:val="17"/>
-              </w:rPr>
-              <w:t>metrics</w:t>
-            </w:r>
-            <w:proofErr w:type="spellEnd"/>
-            <w:r>
-              <w:rPr>
-                <w:rFonts w:ascii="Consolas" w:eastAsia="Consolas" w:hAnsi="Consolas" w:cs="Consolas"/>
-                <w:color w:val="E6EDF3"/>
-                <w:sz w:val="17"/>
-                <w:szCs w:val="17"/>
-              </w:rPr>
-              <w:t xml:space="preserve"> | </w:t>
-            </w:r>
-            <w:proofErr w:type="spellStart"/>
-            <w:r>
-              <w:rPr>
-                <w:rFonts w:ascii="Consolas" w:eastAsia="Consolas" w:hAnsi="Consolas" w:cs="Consolas"/>
-                <w:color w:val="E6EDF3"/>
-                <w:sz w:val="17"/>
-                <w:szCs w:val="17"/>
-              </w:rPr>
-              <w:t>head</w:t>
-            </w:r>
-            <w:proofErr w:type="spellEnd"/>
+              <w:t>$ curl -s localhost:9100/metrics | head</w:t>
+            </w:r>
           </w:p>
         </w:tc>
       </w:tr>
@@ -4818,14 +3714,9 @@
       </w:pPr>
       <w:bookmarkStart w:id="10" w:name="_Toc232510088"/>
       <w:r>
-        <w:t xml:space="preserve">5.3. </w:t>
-      </w:r>
-      <w:proofErr w:type="spellStart"/>
-      <w:r>
-        <w:t>Grafana</w:t>
+        <w:t>5.3. Grafana</w:t>
       </w:r>
       <w:bookmarkEnd w:id="10"/>
-      <w:proofErr w:type="spellEnd"/>
     </w:p>
     <w:p>
       <w:pPr>
@@ -4833,23 +3724,7 @@
         <w:jc w:val="both"/>
       </w:pPr>
       <w:r>
-        <w:t xml:space="preserve">Le script install_grafana.sh ajoute le dépôt officiel, installe </w:t>
-      </w:r>
-      <w:proofErr w:type="spellStart"/>
-      <w:r>
-        <w:t>Grafana</w:t>
-      </w:r>
-      <w:proofErr w:type="spellEnd"/>
-      <w:r>
-        <w:t xml:space="preserve">, puis déploie le provisionnement « as-code » (source de données, fournisseur de tableaux de bord, règles d’alerte). Au démarrage, </w:t>
-      </w:r>
-      <w:proofErr w:type="spellStart"/>
-      <w:r>
-        <w:t>Grafana</w:t>
-      </w:r>
-      <w:proofErr w:type="spellEnd"/>
-      <w:r>
-        <w:t xml:space="preserve"> lit automatiquement ces fichiers.</w:t>
+        <w:t>Le script install_grafana.sh ajoute le dépôt officiel, installe Grafana, puis déploie le provisionnement « as-code » (source de données, fournisseur de tableaux de bord, règles d’alerte). Au démarrage, Grafana lit automatiquement ces fichiers.</w:t>
       </w:r>
     </w:p>
     <w:tbl>
@@ -4900,8 +3775,6 @@
             <w:pPr>
               <w:spacing w:after="40"/>
             </w:pPr>
-            <w:proofErr w:type="spellStart"/>
-            <w:proofErr w:type="gramStart"/>
             <w:r>
               <w:rPr>
                 <w:rFonts w:ascii="Consolas" w:eastAsia="Consolas" w:hAnsi="Consolas" w:cs="Consolas"/>
@@ -4913,8 +3786,6 @@
               </w:rPr>
               <w:t>bash</w:t>
             </w:r>
-            <w:proofErr w:type="spellEnd"/>
-            <w:proofErr w:type="gramEnd"/>
           </w:p>
           <w:p>
             <w:r>
@@ -4924,9 +3795,8 @@
                 <w:sz w:val="17"/>
                 <w:szCs w:val="17"/>
               </w:rPr>
-              <w:t xml:space="preserve"># Sur </w:t>
-            </w:r>
-            <w:proofErr w:type="spellStart"/>
+              <w:t># Sur s</w:t>
+            </w:r>
             <w:r>
               <w:rPr>
                 <w:rFonts w:ascii="Consolas" w:eastAsia="Consolas" w:hAnsi="Consolas" w:cs="Consolas"/>
@@ -4934,8 +3804,10 @@
                 <w:sz w:val="17"/>
                 <w:szCs w:val="17"/>
               </w:rPr>
-              <w:t>s</w:t>
-            </w:r>
+              <w:t>rv-monitor</w:t>
+            </w:r>
+          </w:p>
+          <w:p>
             <w:r>
               <w:rPr>
                 <w:rFonts w:ascii="Consolas" w:eastAsia="Consolas" w:hAnsi="Consolas" w:cs="Consolas"/>
@@ -4943,9 +3815,10 @@
                 <w:sz w:val="17"/>
                 <w:szCs w:val="17"/>
               </w:rPr>
-              <w:t>rv</w:t>
-            </w:r>
-            <w:proofErr w:type="spellEnd"/>
+              <w:t>$ sudo bash scripts/install_grafana.sh</w:t>
+            </w:r>
+          </w:p>
+          <w:p>
             <w:r>
               <w:rPr>
                 <w:rFonts w:ascii="Consolas" w:eastAsia="Consolas" w:hAnsi="Consolas" w:cs="Consolas"/>
@@ -4953,7 +3826,7 @@
                 <w:sz w:val="17"/>
                 <w:szCs w:val="17"/>
               </w:rPr>
-              <w:t>-monitor</w:t>
+              <w:t> </w:t>
             </w:r>
           </w:p>
           <w:p>
@@ -4964,9 +3837,10 @@
                 <w:sz w:val="17"/>
                 <w:szCs w:val="17"/>
               </w:rPr>
-              <w:t xml:space="preserve">$ </w:t>
-            </w:r>
-            <w:proofErr w:type="spellStart"/>
+              <w:t># Grafana écoute sur le port 3000</w:t>
+            </w:r>
+          </w:p>
+          <w:p>
             <w:r>
               <w:rPr>
                 <w:rFonts w:ascii="Consolas" w:eastAsia="Consolas" w:hAnsi="Consolas" w:cs="Consolas"/>
@@ -4974,150 +3848,7 @@
                 <w:sz w:val="17"/>
                 <w:szCs w:val="17"/>
               </w:rPr>
-              <w:t>sudo</w:t>
-            </w:r>
-            <w:proofErr w:type="spellEnd"/>
-            <w:r>
-              <w:rPr>
-                <w:rFonts w:ascii="Consolas" w:eastAsia="Consolas" w:hAnsi="Consolas" w:cs="Consolas"/>
-                <w:color w:val="E6EDF3"/>
-                <w:sz w:val="17"/>
-                <w:szCs w:val="17"/>
-              </w:rPr>
-              <w:t xml:space="preserve"> </w:t>
-            </w:r>
-            <w:proofErr w:type="spellStart"/>
-            <w:r>
-              <w:rPr>
-                <w:rFonts w:ascii="Consolas" w:eastAsia="Consolas" w:hAnsi="Consolas" w:cs="Consolas"/>
-                <w:color w:val="E6EDF3"/>
-                <w:sz w:val="17"/>
-                <w:szCs w:val="17"/>
-              </w:rPr>
-              <w:t>bash</w:t>
-            </w:r>
-            <w:proofErr w:type="spellEnd"/>
-            <w:r>
-              <w:rPr>
-                <w:rFonts w:ascii="Consolas" w:eastAsia="Consolas" w:hAnsi="Consolas" w:cs="Consolas"/>
-                <w:color w:val="E6EDF3"/>
-                <w:sz w:val="17"/>
-                <w:szCs w:val="17"/>
-              </w:rPr>
-              <w:t xml:space="preserve"> scripts/install_grafana.sh</w:t>
-            </w:r>
-          </w:p>
-          <w:p>
-            <w:r>
-              <w:rPr>
-                <w:rFonts w:ascii="Consolas" w:eastAsia="Consolas" w:hAnsi="Consolas" w:cs="Consolas"/>
-                <w:color w:val="E6EDF3"/>
-                <w:sz w:val="17"/>
-                <w:szCs w:val="17"/>
-              </w:rPr>
-              <w:t> </w:t>
-            </w:r>
-          </w:p>
-          <w:p>
-            <w:r>
-              <w:rPr>
-                <w:rFonts w:ascii="Consolas" w:eastAsia="Consolas" w:hAnsi="Consolas" w:cs="Consolas"/>
-                <w:color w:val="E6EDF3"/>
-                <w:sz w:val="17"/>
-                <w:szCs w:val="17"/>
-              </w:rPr>
-              <w:t xml:space="preserve"># </w:t>
-            </w:r>
-            <w:proofErr w:type="spellStart"/>
-            <w:r>
-              <w:rPr>
-                <w:rFonts w:ascii="Consolas" w:eastAsia="Consolas" w:hAnsi="Consolas" w:cs="Consolas"/>
-                <w:color w:val="E6EDF3"/>
-                <w:sz w:val="17"/>
-                <w:szCs w:val="17"/>
-              </w:rPr>
-              <w:t>Grafana</w:t>
-            </w:r>
-            <w:proofErr w:type="spellEnd"/>
-            <w:r>
-              <w:rPr>
-                <w:rFonts w:ascii="Consolas" w:eastAsia="Consolas" w:hAnsi="Consolas" w:cs="Consolas"/>
-                <w:color w:val="E6EDF3"/>
-                <w:sz w:val="17"/>
-                <w:szCs w:val="17"/>
-              </w:rPr>
-              <w:t xml:space="preserve"> écoute sur le port 3000</w:t>
-            </w:r>
-          </w:p>
-          <w:p>
-            <w:r>
-              <w:rPr>
-                <w:rFonts w:ascii="Consolas" w:eastAsia="Consolas" w:hAnsi="Consolas" w:cs="Consolas"/>
-                <w:color w:val="E6EDF3"/>
-                <w:sz w:val="17"/>
-                <w:szCs w:val="17"/>
-              </w:rPr>
-              <w:t xml:space="preserve">$ </w:t>
-            </w:r>
-            <w:proofErr w:type="spellStart"/>
-            <w:r>
-              <w:rPr>
-                <w:rFonts w:ascii="Consolas" w:eastAsia="Consolas" w:hAnsi="Consolas" w:cs="Consolas"/>
-                <w:color w:val="E6EDF3"/>
-                <w:sz w:val="17"/>
-                <w:szCs w:val="17"/>
-              </w:rPr>
-              <w:t>systemctl</w:t>
-            </w:r>
-            <w:proofErr w:type="spellEnd"/>
-            <w:r>
-              <w:rPr>
-                <w:rFonts w:ascii="Consolas" w:eastAsia="Consolas" w:hAnsi="Consolas" w:cs="Consolas"/>
-                <w:color w:val="E6EDF3"/>
-                <w:sz w:val="17"/>
-                <w:szCs w:val="17"/>
-              </w:rPr>
-              <w:t xml:space="preserve"> </w:t>
-            </w:r>
-            <w:proofErr w:type="spellStart"/>
-            <w:r>
-              <w:rPr>
-                <w:rFonts w:ascii="Consolas" w:eastAsia="Consolas" w:hAnsi="Consolas" w:cs="Consolas"/>
-                <w:color w:val="E6EDF3"/>
-                <w:sz w:val="17"/>
-                <w:szCs w:val="17"/>
-              </w:rPr>
-              <w:t>status</w:t>
-            </w:r>
-            <w:proofErr w:type="spellEnd"/>
-            <w:r>
-              <w:rPr>
-                <w:rFonts w:ascii="Consolas" w:eastAsia="Consolas" w:hAnsi="Consolas" w:cs="Consolas"/>
-                <w:color w:val="E6EDF3"/>
-                <w:sz w:val="17"/>
-                <w:szCs w:val="17"/>
-              </w:rPr>
-              <w:t xml:space="preserve"> </w:t>
-            </w:r>
-            <w:proofErr w:type="spellStart"/>
-            <w:r>
-              <w:rPr>
-                <w:rFonts w:ascii="Consolas" w:eastAsia="Consolas" w:hAnsi="Consolas" w:cs="Consolas"/>
-                <w:color w:val="E6EDF3"/>
-                <w:sz w:val="17"/>
-                <w:szCs w:val="17"/>
-              </w:rPr>
-              <w:t>grafana</w:t>
-            </w:r>
-            <w:proofErr w:type="spellEnd"/>
-            <w:r>
-              <w:rPr>
-                <w:rFonts w:ascii="Consolas" w:eastAsia="Consolas" w:hAnsi="Consolas" w:cs="Consolas"/>
-                <w:color w:val="E6EDF3"/>
-                <w:sz w:val="17"/>
-                <w:szCs w:val="17"/>
-              </w:rPr>
-              <w:t>-server</w:t>
+              <w:t>$ systemctl status grafana-server</w:t>
             </w:r>
           </w:p>
         </w:tc>
@@ -5129,26 +3860,10 @@
         <w:jc w:val="both"/>
       </w:pPr>
       <w:r>
-        <w:t xml:space="preserve">L’interface de </w:t>
-      </w:r>
-      <w:proofErr w:type="spellStart"/>
-      <w:r>
-        <w:t>Grafana</w:t>
-      </w:r>
-      <w:proofErr w:type="spellEnd"/>
-      <w:r>
-        <w:t xml:space="preserve"> est alors accessible à http://192.168.56.10:3000 (identifiants par défaut admin / admin, à changer à la première</w:t>
-      </w:r>
-      <w:r>
-        <w:t xml:space="preserve"> connexion). La source de données </w:t>
-      </w:r>
-      <w:proofErr w:type="spellStart"/>
-      <w:r>
-        <w:t>Prometheus</w:t>
-      </w:r>
-      <w:proofErr w:type="spellEnd"/>
-      <w:r>
-        <w:t xml:space="preserve"> et le dossier « E-Service Linux » doivent déjà être présents, signe que le provisionnement a réussi.</w:t>
+        <w:t>L’interface de Grafana est alors accessible à http://192.168.56.10:3000 (identifiants par défaut admin / admin, à changer à la première</w:t>
+      </w:r>
+      <w:r>
+        <w:t xml:space="preserve"> connexion). La source de données Prometheus et le dossier « E-Service Linux » doivent déjà être présents, signe que le provisionnement a réussi.</w:t>
       </w:r>
     </w:p>
     <w:tbl>
@@ -5201,7 +3916,6 @@
               <w:spacing w:after="60"/>
               <w:jc w:val="center"/>
             </w:pPr>
-            <w:proofErr w:type="gramStart"/>
             <w:r>
               <w:rPr>
                 <w:b/>
@@ -5220,18 +3934,7 @@
                 <w:sz w:val="21"/>
                 <w:szCs w:val="21"/>
               </w:rPr>
-              <w:t xml:space="preserve">  Capture</w:t>
-            </w:r>
-            <w:proofErr w:type="gramEnd"/>
-            <w:r>
-              <w:rPr>
-                <w:b/>
-                <w:bCs/>
-                <w:color w:val="1F3A5F"/>
-                <w:sz w:val="21"/>
-                <w:szCs w:val="21"/>
-              </w:rPr>
-              <w:t xml:space="preserve"> 4 — Source de données provisionnée</w:t>
+              <w:t xml:space="preserve">  Capture 4 — Source de données provisionnée</w:t>
             </w:r>
           </w:p>
           <w:p>
@@ -5247,74 +3950,20 @@
                 <w:sz w:val="19"/>
                 <w:szCs w:val="19"/>
               </w:rPr>
-              <w:t xml:space="preserve">Capturer la page Connections → Data sources de </w:t>
-            </w:r>
-            <w:proofErr w:type="spellStart"/>
-            <w:r>
-              <w:rPr>
-                <w:i/>
-                <w:iCs/>
-                <w:color w:val="555555"/>
-                <w:sz w:val="19"/>
-                <w:szCs w:val="19"/>
-              </w:rPr>
-              <w:t>Grafana</w:t>
-            </w:r>
-            <w:proofErr w:type="spellEnd"/>
-            <w:r>
-              <w:rPr>
-                <w:i/>
-                <w:iCs/>
-                <w:color w:val="555555"/>
-                <w:sz w:val="19"/>
-                <w:szCs w:val="19"/>
-              </w:rPr>
-              <w:t xml:space="preserve">, montrant la source </w:t>
-            </w:r>
-            <w:proofErr w:type="spellStart"/>
-            <w:r>
-              <w:rPr>
-                <w:i/>
-                <w:iCs/>
-                <w:color w:val="555555"/>
-                <w:sz w:val="19"/>
-                <w:szCs w:val="19"/>
-              </w:rPr>
-              <w:t>Prometheus</w:t>
-            </w:r>
-            <w:proofErr w:type="spellEnd"/>
-            <w:r>
-              <w:rPr>
-                <w:i/>
-                <w:iCs/>
-                <w:color w:val="555555"/>
-                <w:sz w:val="19"/>
-                <w:szCs w:val="19"/>
-              </w:rPr>
-              <w:t xml:space="preserve"> déjà configurée.</w:t>
+              <w:t>Capturer la page Connections → Data sources de Grafana, montrant la source Prometheus déjà configurée.</w:t>
             </w:r>
           </w:p>
           <w:p>
             <w:pPr>
               <w:jc w:val="center"/>
             </w:pPr>
-            <w:proofErr w:type="gramStart"/>
             <w:r>
               <w:rPr>
                 <w:color w:val="9DB8D2"/>
                 <w:sz w:val="18"/>
                 <w:szCs w:val="18"/>
               </w:rPr>
-              <w:t>[ Insérer</w:t>
-            </w:r>
-            <w:proofErr w:type="gramEnd"/>
-            <w:r>
-              <w:rPr>
-                <w:color w:val="9DB8D2"/>
-                <w:sz w:val="18"/>
-                <w:szCs w:val="18"/>
-              </w:rPr>
-              <w:t xml:space="preserve"> la capture d’écran ici ]</w:t>
+              <w:t>[ Insérer la capture d’écran ici ]</w:t>
             </w:r>
           </w:p>
         </w:tc>
@@ -5326,7 +3975,6 @@
       </w:pPr>
       <w:bookmarkStart w:id="11" w:name="_Toc232510089"/>
       <w:r>
-        <w:lastRenderedPageBreak/>
         <w:t>6. Déploiement du serveur applicatif (srv-web01)</w:t>
       </w:r>
       <w:bookmarkEnd w:id="11"/>
@@ -5337,18 +3985,11 @@
         <w:jc w:val="both"/>
       </w:pPr>
       <w:r>
+        <w:lastRenderedPageBreak/>
         <w:t>Le serveur srv-web01 héberge l’application Flask instrumentée, qui p</w:t>
       </w:r>
       <w:r>
-        <w:t xml:space="preserve">roduit les métriques RED visualisées dans le tableau de bord Golden </w:t>
-      </w:r>
-      <w:proofErr w:type="spellStart"/>
-      <w:r>
-        <w:t>Signals</w:t>
-      </w:r>
-      <w:proofErr w:type="spellEnd"/>
-      <w:r>
-        <w:t>. Après avoir installé Node Exporter (section 5.2), exécutez le script de mise en place de l’application.</w:t>
+        <w:t>roduit les métriques RED visualisées dans le tableau de bord Golden Signals. Après avoir installé Node Exporter (section 5.2), exécutez le script de mise en place de l’application.</w:t>
       </w:r>
     </w:p>
     <w:tbl>
@@ -5399,8 +4040,6 @@
             <w:pPr>
               <w:spacing w:after="40"/>
             </w:pPr>
-            <w:proofErr w:type="spellStart"/>
-            <w:proofErr w:type="gramStart"/>
             <w:r>
               <w:rPr>
                 <w:rFonts w:ascii="Consolas" w:eastAsia="Consolas" w:hAnsi="Consolas" w:cs="Consolas"/>
@@ -5412,8 +4051,6 @@
               </w:rPr>
               <w:t>bash</w:t>
             </w:r>
-            <w:proofErr w:type="spellEnd"/>
-            <w:proofErr w:type="gramEnd"/>
           </w:p>
           <w:p>
             <w:r>
@@ -5434,9 +4071,10 @@
                 <w:sz w:val="17"/>
                 <w:szCs w:val="17"/>
               </w:rPr>
-              <w:t xml:space="preserve">$ </w:t>
-            </w:r>
-            <w:proofErr w:type="spellStart"/>
+              <w:t>$ sudo bash scripts/install_webapp.sh</w:t>
+            </w:r>
+          </w:p>
+          <w:p>
             <w:r>
               <w:rPr>
                 <w:rFonts w:ascii="Consolas" w:eastAsia="Consolas" w:hAnsi="Consolas" w:cs="Consolas"/>
@@ -5444,9 +4082,10 @@
                 <w:sz w:val="17"/>
                 <w:szCs w:val="17"/>
               </w:rPr>
-              <w:t>sudo</w:t>
-            </w:r>
-            <w:proofErr w:type="spellEnd"/>
+              <w:t> </w:t>
+            </w:r>
+          </w:p>
+          <w:p>
             <w:r>
               <w:rPr>
                 <w:rFonts w:ascii="Consolas" w:eastAsia="Consolas" w:hAnsi="Consolas" w:cs="Consolas"/>
@@ -5454,9 +4093,8 @@
                 <w:sz w:val="17"/>
                 <w:szCs w:val="17"/>
               </w:rPr>
-              <w:t xml:space="preserve"> </w:t>
-            </w:r>
-            <w:proofErr w:type="spellStart"/>
+              <w:t># L’applicatio</w:t>
+            </w:r>
             <w:r>
               <w:rPr>
                 <w:rFonts w:ascii="Consolas" w:eastAsia="Consolas" w:hAnsi="Consolas" w:cs="Consolas"/>
@@ -5464,9 +4102,10 @@
                 <w:sz w:val="17"/>
                 <w:szCs w:val="17"/>
               </w:rPr>
-              <w:t>bash</w:t>
-            </w:r>
-            <w:proofErr w:type="spellEnd"/>
+              <w:t>n est servie par Gunicorn sur le port 8000</w:t>
+            </w:r>
+          </w:p>
+          <w:p>
             <w:r>
               <w:rPr>
                 <w:rFonts w:ascii="Consolas" w:eastAsia="Consolas" w:hAnsi="Consolas" w:cs="Consolas"/>
@@ -5474,181 +4113,8 @@
                 <w:sz w:val="17"/>
                 <w:szCs w:val="17"/>
               </w:rPr>
-              <w:t xml:space="preserve"> scripts/install_webapp.sh</w:t>
-            </w:r>
-          </w:p>
-          <w:p>
-            <w:r>
-              <w:rPr>
-                <w:rFonts w:ascii="Consolas" w:eastAsia="Consolas" w:hAnsi="Consolas" w:cs="Consolas"/>
-                <w:color w:val="E6EDF3"/>
-                <w:sz w:val="17"/>
-                <w:szCs w:val="17"/>
-              </w:rPr>
-              <w:t> </w:t>
-            </w:r>
-          </w:p>
-          <w:p>
-            <w:r>
-              <w:rPr>
-                <w:rFonts w:ascii="Consolas" w:eastAsia="Consolas" w:hAnsi="Consolas" w:cs="Consolas"/>
-                <w:color w:val="E6EDF3"/>
-                <w:sz w:val="17"/>
-                <w:szCs w:val="17"/>
-              </w:rPr>
-              <w:t># L’applicatio</w:t>
-            </w:r>
-            <w:r>
-              <w:rPr>
-                <w:rFonts w:ascii="Consolas" w:eastAsia="Consolas" w:hAnsi="Consolas" w:cs="Consolas"/>
-                <w:color w:val="E6EDF3"/>
-                <w:sz w:val="17"/>
-                <w:szCs w:val="17"/>
-              </w:rPr>
-              <w:t xml:space="preserve">n est servie par </w:t>
-            </w:r>
-            <w:proofErr w:type="spellStart"/>
-            <w:r>
-              <w:rPr>
-                <w:rFonts w:ascii="Consolas" w:eastAsia="Consolas" w:hAnsi="Consolas" w:cs="Consolas"/>
-                <w:color w:val="E6EDF3"/>
-                <w:sz w:val="17"/>
-                <w:szCs w:val="17"/>
-              </w:rPr>
-              <w:t>Gunicorn</w:t>
-            </w:r>
-            <w:proofErr w:type="spellEnd"/>
-            <w:r>
-              <w:rPr>
-                <w:rFonts w:ascii="Consolas" w:eastAsia="Consolas" w:hAnsi="Consolas" w:cs="Consolas"/>
-                <w:color w:val="E6EDF3"/>
-                <w:sz w:val="17"/>
-                <w:szCs w:val="17"/>
-              </w:rPr>
-              <w:t xml:space="preserve"> sur le port 8000</w:t>
-            </w:r>
-          </w:p>
-          <w:p>
-            <w:r>
-              <w:rPr>
-                <w:rFonts w:ascii="Consolas" w:eastAsia="Consolas" w:hAnsi="Consolas" w:cs="Consolas"/>
-                <w:color w:val="E6EDF3"/>
-                <w:sz w:val="17"/>
-                <w:szCs w:val="17"/>
-              </w:rPr>
-              <w:t xml:space="preserve">$ </w:t>
-            </w:r>
-            <w:proofErr w:type="spellStart"/>
-            <w:r>
-              <w:rPr>
-                <w:rFonts w:ascii="Consolas" w:eastAsia="Consolas" w:hAnsi="Consolas" w:cs="Consolas"/>
-                <w:color w:val="E6EDF3"/>
-                <w:sz w:val="17"/>
-                <w:szCs w:val="17"/>
-              </w:rPr>
-              <w:t>curl</w:t>
-            </w:r>
-            <w:proofErr w:type="spellEnd"/>
-            <w:r>
-              <w:rPr>
-                <w:rFonts w:ascii="Consolas" w:eastAsia="Consolas" w:hAnsi="Consolas" w:cs="Consolas"/>
-                <w:color w:val="E6EDF3"/>
-                <w:sz w:val="17"/>
-                <w:szCs w:val="17"/>
-              </w:rPr>
-              <w:t xml:space="preserve"> -s </w:t>
-            </w:r>
-            <w:proofErr w:type="gramStart"/>
-            <w:r>
-              <w:rPr>
-                <w:rFonts w:ascii="Consolas" w:eastAsia="Consolas" w:hAnsi="Consolas" w:cs="Consolas"/>
-                <w:color w:val="E6EDF3"/>
-                <w:sz w:val="17"/>
-                <w:szCs w:val="17"/>
-              </w:rPr>
-              <w:t>localhost:</w:t>
-            </w:r>
-            <w:proofErr w:type="gramEnd"/>
-            <w:r>
-              <w:rPr>
-                <w:rFonts w:ascii="Consolas" w:eastAsia="Consolas" w:hAnsi="Consolas" w:cs="Consolas"/>
-                <w:color w:val="E6EDF3"/>
-                <w:sz w:val="17"/>
-                <w:szCs w:val="17"/>
-              </w:rPr>
-              <w:t>8000/</w:t>
-            </w:r>
-            <w:proofErr w:type="spellStart"/>
-            <w:r>
-              <w:rPr>
-                <w:rFonts w:ascii="Consolas" w:eastAsia="Consolas" w:hAnsi="Consolas" w:cs="Consolas"/>
-                <w:color w:val="E6EDF3"/>
-                <w:sz w:val="17"/>
-                <w:szCs w:val="17"/>
-              </w:rPr>
-              <w:t>metrics</w:t>
-            </w:r>
-            <w:proofErr w:type="spellEnd"/>
-            <w:r>
-              <w:rPr>
-                <w:rFonts w:ascii="Consolas" w:eastAsia="Consolas" w:hAnsi="Consolas" w:cs="Consolas"/>
-                <w:color w:val="E6EDF3"/>
-                <w:sz w:val="17"/>
-                <w:szCs w:val="17"/>
-              </w:rPr>
-              <w:t xml:space="preserve"> | </w:t>
-            </w:r>
-            <w:proofErr w:type="spellStart"/>
-            <w:r>
-              <w:rPr>
-                <w:rFonts w:ascii="Consolas" w:eastAsia="Consolas" w:hAnsi="Consolas" w:cs="Consolas"/>
-                <w:color w:val="E6EDF3"/>
-                <w:sz w:val="17"/>
-                <w:szCs w:val="17"/>
-              </w:rPr>
-              <w:t>grep</w:t>
-            </w:r>
-            <w:proofErr w:type="spellEnd"/>
-            <w:r>
-              <w:rPr>
-                <w:rFonts w:ascii="Consolas" w:eastAsia="Consolas" w:hAnsi="Consolas" w:cs="Consolas"/>
-                <w:color w:val="E6EDF3"/>
-                <w:sz w:val="17"/>
-                <w:szCs w:val="17"/>
-              </w:rPr>
-              <w:t xml:space="preserve"> </w:t>
-            </w:r>
-            <w:proofErr w:type="spellStart"/>
-            <w:r>
-              <w:rPr>
-                <w:rFonts w:ascii="Consolas" w:eastAsia="Consolas" w:hAnsi="Consolas" w:cs="Consolas"/>
-                <w:color w:val="E6EDF3"/>
-                <w:sz w:val="17"/>
-                <w:szCs w:val="17"/>
-              </w:rPr>
-              <w:t>http_requests_total</w:t>
-            </w:r>
-            <w:proofErr w:type="spellEnd"/>
-            <w:r>
-              <w:rPr>
-                <w:rFonts w:ascii="Consolas" w:eastAsia="Consolas" w:hAnsi="Consolas" w:cs="Consolas"/>
-                <w:color w:val="E6EDF3"/>
-                <w:sz w:val="17"/>
-                <w:szCs w:val="17"/>
-              </w:rPr>
-              <w:t xml:space="preserve"> | </w:t>
-            </w:r>
-            <w:proofErr w:type="spellStart"/>
-            <w:r>
-              <w:rPr>
-                <w:rFonts w:ascii="Consolas" w:eastAsia="Consolas" w:hAnsi="Consolas" w:cs="Consolas"/>
-                <w:color w:val="E6EDF3"/>
-                <w:sz w:val="17"/>
-                <w:szCs w:val="17"/>
-              </w:rPr>
-              <w:t>head</w:t>
-            </w:r>
-            <w:proofErr w:type="spellEnd"/>
+              <w:t>$ curl -s localhost:8000/metrics | grep http_requests_total | head</w:t>
+            </w:r>
           </w:p>
         </w:tc>
       </w:tr>
@@ -5659,23 +4125,7 @@
         <w:jc w:val="both"/>
       </w:pPr>
       <w:r>
-        <w:t xml:space="preserve">Le script crée un environnement Python isolé, installe les dépendances (Flask, </w:t>
-      </w:r>
-      <w:proofErr w:type="spellStart"/>
-      <w:r>
-        <w:t>prometheus</w:t>
-      </w:r>
-      <w:proofErr w:type="spellEnd"/>
-      <w:r>
-        <w:t xml:space="preserve">-client, </w:t>
-      </w:r>
-      <w:proofErr w:type="spellStart"/>
-      <w:r>
-        <w:t>Gunicorn</w:t>
-      </w:r>
-      <w:proofErr w:type="spellEnd"/>
-      <w:r>
-        <w:t xml:space="preserve">) et démarre l’application en tant que service. Pour alimenter les tableaux de bord en données réalistes, lancez le générateur de trafic, qui produit </w:t>
+        <w:t xml:space="preserve">Le script crée un environnement Python isolé, installe les dépendances (Flask, prometheus-client, Gunicorn) et démarre l’application en tant que service. Pour alimenter les tableaux de bord en données réalistes, lancez le générateur de trafic, qui produit </w:t>
       </w:r>
       <w:r>
         <w:t>un flux d’environ vingt requêtes par seconde réparties sur les différents points d’accès.</w:t>
@@ -5736,8 +4186,6 @@
             <w:pPr>
               <w:spacing w:after="40"/>
             </w:pPr>
-            <w:proofErr w:type="spellStart"/>
-            <w:proofErr w:type="gramStart"/>
             <w:r>
               <w:rPr>
                 <w:rFonts w:ascii="Consolas" w:eastAsia="Consolas" w:hAnsi="Consolas" w:cs="Consolas"/>
@@ -5749,8 +4197,6 @@
               </w:rPr>
               <w:t>bash</w:t>
             </w:r>
-            <w:proofErr w:type="spellEnd"/>
-            <w:proofErr w:type="gramEnd"/>
           </w:p>
           <w:p>
             <w:r>
@@ -5830,23 +4276,7 @@
                 <w:sz w:val="20"/>
                 <w:szCs w:val="20"/>
               </w:rPr>
-              <w:t xml:space="preserve">Sans requêtes, les métriques de latence et de taux d’erreurs restent plates. Le générateur simule une activité utilisateur pour que les panneaux Golden </w:t>
-            </w:r>
-            <w:proofErr w:type="spellStart"/>
-            <w:r>
-              <w:rPr>
-                <w:sz w:val="20"/>
-                <w:szCs w:val="20"/>
-              </w:rPr>
-              <w:t>Signals</w:t>
-            </w:r>
-            <w:proofErr w:type="spellEnd"/>
-            <w:r>
-              <w:rPr>
-                <w:sz w:val="20"/>
-                <w:szCs w:val="20"/>
-              </w:rPr>
-              <w:t xml:space="preserve"> affichent des courbes vivantes pendant la démonstration. Laissez-le tourner dans un terminal sép</w:t>
+              <w:t>Sans requêtes, les métriques de latence et de taux d’erreurs restent plates. Le générateur simule une activité utilisateur pour que les panneaux Golden Signals affichent des courbes vivantes pendant la démonstration. Laissez-le tourner dans un terminal sép</w:t>
             </w:r>
             <w:r>
               <w:rPr>
@@ -5875,15 +4305,7 @@
         <w:jc w:val="both"/>
       </w:pPr>
       <w:r>
-        <w:t xml:space="preserve">Le serveur srv-db01 héberge PostgreSQL et son exporter, </w:t>
-      </w:r>
-      <w:proofErr w:type="spellStart"/>
-      <w:r>
-        <w:t>postgres_exporter</w:t>
-      </w:r>
-      <w:proofErr w:type="spellEnd"/>
-      <w:r>
-        <w:t>, qui expose les métriques de la base sur le port 9187. Après l’installation de Node Exporter (section 5.2), installez PostgreSQL depuis les dépôts Debian, créez un compte de supervis</w:t>
+        <w:t>Le serveur srv-db01 héberge PostgreSQL et son exporter, postgres_exporter, qui expose les métriques de la base sur le port 9187. Après l’installation de Node Exporter (section 5.2), installez PostgreSQL depuis les dépôts Debian, créez un compte de supervis</w:t>
       </w:r>
       <w:r>
         <w:t>ion en lecture seule, puis déployez l’exporter.</w:t>
@@ -5937,8 +4359,6 @@
             <w:pPr>
               <w:spacing w:after="40"/>
             </w:pPr>
-            <w:proofErr w:type="spellStart"/>
-            <w:proofErr w:type="gramStart"/>
             <w:r>
               <w:rPr>
                 <w:rFonts w:ascii="Consolas" w:eastAsia="Consolas" w:hAnsi="Consolas" w:cs="Consolas"/>
@@ -5950,8 +4370,6 @@
               </w:rPr>
               <w:t>bash</w:t>
             </w:r>
-            <w:proofErr w:type="spellEnd"/>
-            <w:proofErr w:type="gramEnd"/>
           </w:p>
           <w:p>
             <w:r>
@@ -5972,9 +4390,10 @@
                 <w:sz w:val="17"/>
                 <w:szCs w:val="17"/>
               </w:rPr>
-              <w:t xml:space="preserve">$ </w:t>
-            </w:r>
-            <w:proofErr w:type="spellStart"/>
+              <w:t>$ sudo apt update &amp;&amp; sudo apt install -y postgresql</w:t>
+            </w:r>
+          </w:p>
+          <w:p>
             <w:r>
               <w:rPr>
                 <w:rFonts w:ascii="Consolas" w:eastAsia="Consolas" w:hAnsi="Consolas" w:cs="Consolas"/>
@@ -5982,9 +4401,10 @@
                 <w:sz w:val="17"/>
                 <w:szCs w:val="17"/>
               </w:rPr>
-              <w:t>sudo</w:t>
-            </w:r>
-            <w:proofErr w:type="spellEnd"/>
+              <w:t> </w:t>
+            </w:r>
+          </w:p>
+          <w:p>
             <w:r>
               <w:rPr>
                 <w:rFonts w:ascii="Consolas" w:eastAsia="Consolas" w:hAnsi="Consolas" w:cs="Consolas"/>
@@ -5992,9 +4412,10 @@
                 <w:sz w:val="17"/>
                 <w:szCs w:val="17"/>
               </w:rPr>
-              <w:t xml:space="preserve"> </w:t>
-            </w:r>
-            <w:proofErr w:type="spellStart"/>
+              <w:t># Créer un rôle de supervision (lecture des statistiques)</w:t>
+            </w:r>
+          </w:p>
+          <w:p>
             <w:r>
               <w:rPr>
                 <w:rFonts w:ascii="Consolas" w:eastAsia="Consolas" w:hAnsi="Consolas" w:cs="Consolas"/>
@@ -6002,9 +4423,8 @@
                 <w:sz w:val="17"/>
                 <w:szCs w:val="17"/>
               </w:rPr>
-              <w:t>apt</w:t>
-            </w:r>
-            <w:proofErr w:type="spellEnd"/>
+              <w:t>$ sudo -u postgres psql -c "CREATE USER exporte</w:t>
+            </w:r>
             <w:r>
               <w:rPr>
                 <w:rFonts w:ascii="Consolas" w:eastAsia="Consolas" w:hAnsi="Consolas" w:cs="Consolas"/>
@@ -6012,9 +4432,10 @@
                 <w:sz w:val="17"/>
                 <w:szCs w:val="17"/>
               </w:rPr>
-              <w:t xml:space="preserve"> update &amp;&amp; </w:t>
-            </w:r>
-            <w:proofErr w:type="spellStart"/>
+              <w:t>r PASSWORD '&lt;mot_de_passe&gt;';"</w:t>
+            </w:r>
+          </w:p>
+          <w:p>
             <w:r>
               <w:rPr>
                 <w:rFonts w:ascii="Consolas" w:eastAsia="Consolas" w:hAnsi="Consolas" w:cs="Consolas"/>
@@ -6022,321 +4443,7 @@
                 <w:sz w:val="17"/>
                 <w:szCs w:val="17"/>
               </w:rPr>
-              <w:t>sudo</w:t>
-            </w:r>
-            <w:proofErr w:type="spellEnd"/>
-            <w:r>
-              <w:rPr>
-                <w:rFonts w:ascii="Consolas" w:eastAsia="Consolas" w:hAnsi="Consolas" w:cs="Consolas"/>
-                <w:color w:val="E6EDF3"/>
-                <w:sz w:val="17"/>
-                <w:szCs w:val="17"/>
-              </w:rPr>
-              <w:t xml:space="preserve"> </w:t>
-            </w:r>
-            <w:proofErr w:type="spellStart"/>
-            <w:r>
-              <w:rPr>
-                <w:rFonts w:ascii="Consolas" w:eastAsia="Consolas" w:hAnsi="Consolas" w:cs="Consolas"/>
-                <w:color w:val="E6EDF3"/>
-                <w:sz w:val="17"/>
-                <w:szCs w:val="17"/>
-              </w:rPr>
-              <w:t>apt</w:t>
-            </w:r>
-            <w:proofErr w:type="spellEnd"/>
-            <w:r>
-              <w:rPr>
-                <w:rFonts w:ascii="Consolas" w:eastAsia="Consolas" w:hAnsi="Consolas" w:cs="Consolas"/>
-                <w:color w:val="E6EDF3"/>
-                <w:sz w:val="17"/>
-                <w:szCs w:val="17"/>
-              </w:rPr>
-              <w:t xml:space="preserve"> </w:t>
-            </w:r>
-            <w:proofErr w:type="spellStart"/>
-            <w:r>
-              <w:rPr>
-                <w:rFonts w:ascii="Consolas" w:eastAsia="Consolas" w:hAnsi="Consolas" w:cs="Consolas"/>
-                <w:color w:val="E6EDF3"/>
-                <w:sz w:val="17"/>
-                <w:szCs w:val="17"/>
-              </w:rPr>
-              <w:t>install</w:t>
-            </w:r>
-            <w:proofErr w:type="spellEnd"/>
-            <w:r>
-              <w:rPr>
-                <w:rFonts w:ascii="Consolas" w:eastAsia="Consolas" w:hAnsi="Consolas" w:cs="Consolas"/>
-                <w:color w:val="E6EDF3"/>
-                <w:sz w:val="17"/>
-                <w:szCs w:val="17"/>
-              </w:rPr>
-              <w:t xml:space="preserve"> -y </w:t>
-            </w:r>
-            <w:proofErr w:type="spellStart"/>
-            <w:r>
-              <w:rPr>
-                <w:rFonts w:ascii="Consolas" w:eastAsia="Consolas" w:hAnsi="Consolas" w:cs="Consolas"/>
-                <w:color w:val="E6EDF3"/>
-                <w:sz w:val="17"/>
-                <w:szCs w:val="17"/>
-              </w:rPr>
-              <w:t>postgresql</w:t>
-            </w:r>
-            <w:proofErr w:type="spellEnd"/>
-          </w:p>
-          <w:p>
-            <w:r>
-              <w:rPr>
-                <w:rFonts w:ascii="Consolas" w:eastAsia="Consolas" w:hAnsi="Consolas" w:cs="Consolas"/>
-                <w:color w:val="E6EDF3"/>
-                <w:sz w:val="17"/>
-                <w:szCs w:val="17"/>
-              </w:rPr>
-              <w:t> </w:t>
-            </w:r>
-          </w:p>
-          <w:p>
-            <w:r>
-              <w:rPr>
-                <w:rFonts w:ascii="Consolas" w:eastAsia="Consolas" w:hAnsi="Consolas" w:cs="Consolas"/>
-                <w:color w:val="E6EDF3"/>
-                <w:sz w:val="17"/>
-                <w:szCs w:val="17"/>
-              </w:rPr>
-              <w:t># Créer un rôle de supervision (lecture des statistiques)</w:t>
-            </w:r>
-          </w:p>
-          <w:p>
-            <w:r>
-              <w:rPr>
-                <w:rFonts w:ascii="Consolas" w:eastAsia="Consolas" w:hAnsi="Consolas" w:cs="Consolas"/>
-                <w:color w:val="E6EDF3"/>
-                <w:sz w:val="17"/>
-                <w:szCs w:val="17"/>
-              </w:rPr>
-              <w:t xml:space="preserve">$ </w:t>
-            </w:r>
-            <w:proofErr w:type="spellStart"/>
-            <w:r>
-              <w:rPr>
-                <w:rFonts w:ascii="Consolas" w:eastAsia="Consolas" w:hAnsi="Consolas" w:cs="Consolas"/>
-                <w:color w:val="E6EDF3"/>
-                <w:sz w:val="17"/>
-                <w:szCs w:val="17"/>
-              </w:rPr>
-              <w:t>sudo</w:t>
-            </w:r>
-            <w:proofErr w:type="spellEnd"/>
-            <w:r>
-              <w:rPr>
-                <w:rFonts w:ascii="Consolas" w:eastAsia="Consolas" w:hAnsi="Consolas" w:cs="Consolas"/>
-                <w:color w:val="E6EDF3"/>
-                <w:sz w:val="17"/>
-                <w:szCs w:val="17"/>
-              </w:rPr>
-              <w:t xml:space="preserve"> -u </w:t>
-            </w:r>
-            <w:proofErr w:type="spellStart"/>
-            <w:r>
-              <w:rPr>
-                <w:rFonts w:ascii="Consolas" w:eastAsia="Consolas" w:hAnsi="Consolas" w:cs="Consolas"/>
-                <w:color w:val="E6EDF3"/>
-                <w:sz w:val="17"/>
-                <w:szCs w:val="17"/>
-              </w:rPr>
-              <w:t>postgres</w:t>
-            </w:r>
-            <w:proofErr w:type="spellEnd"/>
-            <w:r>
-              <w:rPr>
-                <w:rFonts w:ascii="Consolas" w:eastAsia="Consolas" w:hAnsi="Consolas" w:cs="Consolas"/>
-                <w:color w:val="E6EDF3"/>
-                <w:sz w:val="17"/>
-                <w:szCs w:val="17"/>
-              </w:rPr>
-              <w:t xml:space="preserve"> </w:t>
-            </w:r>
-            <w:proofErr w:type="spellStart"/>
-            <w:r>
-              <w:rPr>
-                <w:rFonts w:ascii="Consolas" w:eastAsia="Consolas" w:hAnsi="Consolas" w:cs="Consolas"/>
-                <w:color w:val="E6EDF3"/>
-                <w:sz w:val="17"/>
-                <w:szCs w:val="17"/>
-              </w:rPr>
-              <w:t>psql</w:t>
-            </w:r>
-            <w:proofErr w:type="spellEnd"/>
-            <w:r>
-              <w:rPr>
-                <w:rFonts w:ascii="Consolas" w:eastAsia="Consolas" w:hAnsi="Consolas" w:cs="Consolas"/>
-                <w:color w:val="E6EDF3"/>
-                <w:sz w:val="17"/>
-                <w:szCs w:val="17"/>
-              </w:rPr>
-              <w:t xml:space="preserve"> -c "CREATE USER exporte</w:t>
-            </w:r>
-            <w:r>
-              <w:rPr>
-                <w:rFonts w:ascii="Consolas" w:eastAsia="Consolas" w:hAnsi="Consolas" w:cs="Consolas"/>
-                <w:color w:val="E6EDF3"/>
-                <w:sz w:val="17"/>
-                <w:szCs w:val="17"/>
-              </w:rPr>
-              <w:t>r PASSWORD '&lt;</w:t>
-            </w:r>
-            <w:proofErr w:type="spellStart"/>
-            <w:r>
-              <w:rPr>
-                <w:rFonts w:ascii="Consolas" w:eastAsia="Consolas" w:hAnsi="Consolas" w:cs="Consolas"/>
-                <w:color w:val="E6EDF3"/>
-                <w:sz w:val="17"/>
-                <w:szCs w:val="17"/>
-              </w:rPr>
-              <w:t>mot_de_passe</w:t>
-            </w:r>
-            <w:proofErr w:type="spellEnd"/>
-            <w:r>
-              <w:rPr>
-                <w:rFonts w:ascii="Consolas" w:eastAsia="Consolas" w:hAnsi="Consolas" w:cs="Consolas"/>
-                <w:color w:val="E6EDF3"/>
-                <w:sz w:val="17"/>
-                <w:szCs w:val="17"/>
-              </w:rPr>
-              <w:t>&gt;</w:t>
-            </w:r>
-            <w:proofErr w:type="gramStart"/>
-            <w:r>
-              <w:rPr>
-                <w:rFonts w:ascii="Consolas" w:eastAsia="Consolas" w:hAnsi="Consolas" w:cs="Consolas"/>
-                <w:color w:val="E6EDF3"/>
-                <w:sz w:val="17"/>
-                <w:szCs w:val="17"/>
-              </w:rPr>
-              <w:t>';</w:t>
-            </w:r>
-            <w:proofErr w:type="gramEnd"/>
-            <w:r>
-              <w:rPr>
-                <w:rFonts w:ascii="Consolas" w:eastAsia="Consolas" w:hAnsi="Consolas" w:cs="Consolas"/>
-                <w:color w:val="E6EDF3"/>
-                <w:sz w:val="17"/>
-                <w:szCs w:val="17"/>
-              </w:rPr>
-              <w:t>"</w:t>
-            </w:r>
-          </w:p>
-          <w:p>
-            <w:r>
-              <w:rPr>
-                <w:rFonts w:ascii="Consolas" w:eastAsia="Consolas" w:hAnsi="Consolas" w:cs="Consolas"/>
-                <w:color w:val="E6EDF3"/>
-                <w:sz w:val="17"/>
-                <w:szCs w:val="17"/>
-              </w:rPr>
-              <w:t xml:space="preserve">$ </w:t>
-            </w:r>
-            <w:proofErr w:type="spellStart"/>
-            <w:r>
-              <w:rPr>
-                <w:rFonts w:ascii="Consolas" w:eastAsia="Consolas" w:hAnsi="Consolas" w:cs="Consolas"/>
-                <w:color w:val="E6EDF3"/>
-                <w:sz w:val="17"/>
-                <w:szCs w:val="17"/>
-              </w:rPr>
-              <w:t>sudo</w:t>
-            </w:r>
-            <w:proofErr w:type="spellEnd"/>
-            <w:r>
-              <w:rPr>
-                <w:rFonts w:ascii="Consolas" w:eastAsia="Consolas" w:hAnsi="Consolas" w:cs="Consolas"/>
-                <w:color w:val="E6EDF3"/>
-                <w:sz w:val="17"/>
-                <w:szCs w:val="17"/>
-              </w:rPr>
-              <w:t xml:space="preserve"> -u </w:t>
-            </w:r>
-            <w:proofErr w:type="spellStart"/>
-            <w:r>
-              <w:rPr>
-                <w:rFonts w:ascii="Consolas" w:eastAsia="Consolas" w:hAnsi="Consolas" w:cs="Consolas"/>
-                <w:color w:val="E6EDF3"/>
-                <w:sz w:val="17"/>
-                <w:szCs w:val="17"/>
-              </w:rPr>
-              <w:t>postgres</w:t>
-            </w:r>
-            <w:proofErr w:type="spellEnd"/>
-            <w:r>
-              <w:rPr>
-                <w:rFonts w:ascii="Consolas" w:eastAsia="Consolas" w:hAnsi="Consolas" w:cs="Consolas"/>
-                <w:color w:val="E6EDF3"/>
-                <w:sz w:val="17"/>
-                <w:szCs w:val="17"/>
-              </w:rPr>
-              <w:t xml:space="preserve"> </w:t>
-            </w:r>
-            <w:proofErr w:type="spellStart"/>
-            <w:r>
-              <w:rPr>
-                <w:rFonts w:ascii="Consolas" w:eastAsia="Consolas" w:hAnsi="Consolas" w:cs="Consolas"/>
-                <w:color w:val="E6EDF3"/>
-                <w:sz w:val="17"/>
-                <w:szCs w:val="17"/>
-              </w:rPr>
-              <w:t>psql</w:t>
-            </w:r>
-            <w:proofErr w:type="spellEnd"/>
-            <w:r>
-              <w:rPr>
-                <w:rFonts w:ascii="Consolas" w:eastAsia="Consolas" w:hAnsi="Consolas" w:cs="Consolas"/>
-                <w:color w:val="E6EDF3"/>
-                <w:sz w:val="17"/>
-                <w:szCs w:val="17"/>
-              </w:rPr>
-              <w:t xml:space="preserve"> -c "GRANT </w:t>
-            </w:r>
-            <w:proofErr w:type="spellStart"/>
-            <w:r>
-              <w:rPr>
-                <w:rFonts w:ascii="Consolas" w:eastAsia="Consolas" w:hAnsi="Consolas" w:cs="Consolas"/>
-                <w:color w:val="E6EDF3"/>
-                <w:sz w:val="17"/>
-                <w:szCs w:val="17"/>
-              </w:rPr>
-              <w:t>pg_monitor</w:t>
-            </w:r>
-            <w:proofErr w:type="spellEnd"/>
-            <w:r>
-              <w:rPr>
-                <w:rFonts w:ascii="Consolas" w:eastAsia="Consolas" w:hAnsi="Consolas" w:cs="Consolas"/>
-                <w:color w:val="E6EDF3"/>
-                <w:sz w:val="17"/>
-                <w:szCs w:val="17"/>
-              </w:rPr>
-              <w:t xml:space="preserve"> TO </w:t>
-            </w:r>
-            <w:proofErr w:type="gramStart"/>
-            <w:r>
-              <w:rPr>
-                <w:rFonts w:ascii="Consolas" w:eastAsia="Consolas" w:hAnsi="Consolas" w:cs="Consolas"/>
-                <w:color w:val="E6EDF3"/>
-                <w:sz w:val="17"/>
-                <w:szCs w:val="17"/>
-              </w:rPr>
-              <w:t>exporter;</w:t>
-            </w:r>
-            <w:proofErr w:type="gramEnd"/>
-            <w:r>
-              <w:rPr>
-                <w:rFonts w:ascii="Consolas" w:eastAsia="Consolas" w:hAnsi="Consolas" w:cs="Consolas"/>
-                <w:color w:val="E6EDF3"/>
-                <w:sz w:val="17"/>
-                <w:szCs w:val="17"/>
-              </w:rPr>
-              <w:t>"</w:t>
+              <w:t>$ sudo -u postgres psql -c "GRANT pg_monitor TO exporter;"</w:t>
             </w:r>
           </w:p>
         </w:tc>
@@ -6348,47 +4455,7 @@
         <w:jc w:val="both"/>
       </w:pPr>
       <w:r>
-        <w:t xml:space="preserve">Une fois </w:t>
-      </w:r>
-      <w:proofErr w:type="spellStart"/>
-      <w:r>
-        <w:t>postgres_exporter</w:t>
-      </w:r>
-      <w:proofErr w:type="spellEnd"/>
-      <w:r>
-        <w:t xml:space="preserve"> </w:t>
-      </w:r>
-      <w:proofErr w:type="gramStart"/>
-      <w:r>
-        <w:t>démarré</w:t>
-      </w:r>
-      <w:proofErr w:type="gramEnd"/>
-      <w:r>
-        <w:t xml:space="preserve">, </w:t>
-      </w:r>
-      <w:proofErr w:type="spellStart"/>
-      <w:r>
-        <w:t>Prometheus</w:t>
-      </w:r>
-      <w:proofErr w:type="spellEnd"/>
-      <w:r>
-        <w:t xml:space="preserve"> collecte automatiquement ses métriques, puisque la cible figure déjà dans le fichier de configuration </w:t>
-      </w:r>
-      <w:proofErr w:type="spellStart"/>
-      <w:r>
-        <w:t>prometheus.yml</w:t>
-      </w:r>
-      <w:proofErr w:type="spellEnd"/>
-      <w:r>
-        <w:t xml:space="preserve">. Vérifiez l’apparition de la nouvelle cible dans la page « </w:t>
-      </w:r>
-      <w:proofErr w:type="spellStart"/>
-      <w:r>
-        <w:t>Targets</w:t>
-      </w:r>
-      <w:proofErr w:type="spellEnd"/>
-      <w:r>
-        <w:t xml:space="preserve"> ».</w:t>
+        <w:t>Une fois postgres_exporter démarré, Prometheus collecte automatiquement ses métriques, puisque la cible figure déjà dans le fichier de configuration prometheus.yml. Vérifiez l’apparition de la nouvelle cible dans la page « Targets ».</w:t>
       </w:r>
     </w:p>
     <w:p>
@@ -6421,26 +4488,10 @@
       </w:pPr>
       <w:r>
         <w:lastRenderedPageBreak/>
-        <w:t xml:space="preserve">Grâce au provisionnement, les deux tableaux de bord sont déjà chargés dans le dossier « E-Service Linux » de </w:t>
-      </w:r>
-      <w:proofErr w:type="spellStart"/>
-      <w:r>
-        <w:t>Grafana</w:t>
-      </w:r>
-      <w:proofErr w:type="spellEnd"/>
-      <w:r>
-        <w:t>. Ouvrez-les successivement, sélectionnez un environnement et une instance dans les variable</w:t>
-      </w:r>
-      <w:r>
-        <w:t xml:space="preserve">s en haut de page, et constatez l’affichage des courbes. Le tableau USE doit montrer l’état de l’infrastructure, le tableau Golden </w:t>
-      </w:r>
-      <w:proofErr w:type="spellStart"/>
-      <w:r>
-        <w:t>Signals</w:t>
-      </w:r>
-      <w:proofErr w:type="spellEnd"/>
-      <w:r>
-        <w:t xml:space="preserve"> la santé de l’application.</w:t>
+        <w:t>Grâce au provisionnement, les deux tableaux de bord sont déjà chargés dans le dossier « E-Service Linux » de Grafana. Ouvrez-les successivement, sélectionnez un environnement et une instance dans les variable</w:t>
+      </w:r>
+      <w:r>
+        <w:t>s en haut de page, et constatez l’affichage des courbes. Le tableau USE doit montrer l’état de l’infrastructure, le tableau Golden Signals la santé de l’application.</w:t>
       </w:r>
     </w:p>
     <w:tbl>
@@ -6493,7 +4544,6 @@
               <w:spacing w:after="60"/>
               <w:jc w:val="center"/>
             </w:pPr>
-            <w:proofErr w:type="gramStart"/>
             <w:r>
               <w:rPr>
                 <w:b/>
@@ -6512,18 +4562,7 @@
                 <w:sz w:val="21"/>
                 <w:szCs w:val="21"/>
               </w:rPr>
-              <w:t xml:space="preserve">  Capture</w:t>
-            </w:r>
-            <w:proofErr w:type="gramEnd"/>
-            <w:r>
-              <w:rPr>
-                <w:b/>
-                <w:bCs/>
-                <w:color w:val="1F3A5F"/>
-                <w:sz w:val="21"/>
-                <w:szCs w:val="21"/>
-              </w:rPr>
-              <w:t xml:space="preserve"> 5 — Tableau de bord USE complet</w:t>
+              <w:t xml:space="preserve">  Capture 5 — Tableau de bord USE complet</w:t>
             </w:r>
           </w:p>
           <w:p>
@@ -6556,23 +4595,13 @@
             <w:pPr>
               <w:jc w:val="center"/>
             </w:pPr>
-            <w:proofErr w:type="gramStart"/>
             <w:r>
               <w:rPr>
                 <w:color w:val="9DB8D2"/>
                 <w:sz w:val="18"/>
                 <w:szCs w:val="18"/>
               </w:rPr>
-              <w:t>[ Insérer</w:t>
-            </w:r>
-            <w:proofErr w:type="gramEnd"/>
-            <w:r>
-              <w:rPr>
-                <w:color w:val="9DB8D2"/>
-                <w:sz w:val="18"/>
-                <w:szCs w:val="18"/>
-              </w:rPr>
-              <w:t xml:space="preserve"> la capture d’écran ici ]</w:t>
+              <w:t>[ Insérer la capture d’écran ici ]</w:t>
             </w:r>
           </w:p>
         </w:tc>
@@ -6633,7 +4662,6 @@
               <w:spacing w:after="60"/>
               <w:jc w:val="center"/>
             </w:pPr>
-            <w:proofErr w:type="gramStart"/>
             <w:r>
               <w:rPr>
                 <w:b/>
@@ -6652,40 +4680,7 @@
                 <w:sz w:val="21"/>
                 <w:szCs w:val="21"/>
               </w:rPr>
-              <w:t xml:space="preserve">  Capture</w:t>
-            </w:r>
-            <w:proofErr w:type="gramEnd"/>
-            <w:r>
-              <w:rPr>
-                <w:b/>
-                <w:bCs/>
-                <w:color w:val="1F3A5F"/>
-                <w:sz w:val="21"/>
-                <w:szCs w:val="21"/>
-              </w:rPr>
-              <w:t xml:space="preserve"> 6 — Tableau de bord Golden </w:t>
-            </w:r>
-            <w:proofErr w:type="spellStart"/>
-            <w:r>
-              <w:rPr>
-                <w:b/>
-                <w:bCs/>
-                <w:color w:val="1F3A5F"/>
-                <w:sz w:val="21"/>
-                <w:szCs w:val="21"/>
-              </w:rPr>
-              <w:t>Signals</w:t>
-            </w:r>
-            <w:proofErr w:type="spellEnd"/>
-            <w:r>
-              <w:rPr>
-                <w:b/>
-                <w:bCs/>
-                <w:color w:val="1F3A5F"/>
-                <w:sz w:val="21"/>
-                <w:szCs w:val="21"/>
-              </w:rPr>
-              <w:t xml:space="preserve"> complet</w:t>
+              <w:t xml:space="preserve">  Capture 6 — Tableau de bord Golden Signals complet</w:t>
             </w:r>
           </w:p>
           <w:p>
@@ -6701,52 +4696,20 @@
                 <w:sz w:val="19"/>
                 <w:szCs w:val="19"/>
               </w:rPr>
-              <w:t xml:space="preserve">Capturer le tableau Golden </w:t>
-            </w:r>
-            <w:proofErr w:type="spellStart"/>
-            <w:r>
-              <w:rPr>
-                <w:i/>
-                <w:iCs/>
-                <w:color w:val="555555"/>
-                <w:sz w:val="19"/>
-                <w:szCs w:val="19"/>
-              </w:rPr>
-              <w:t>Signals</w:t>
-            </w:r>
-            <w:proofErr w:type="spellEnd"/>
-            <w:r>
-              <w:rPr>
-                <w:i/>
-                <w:iCs/>
-                <w:color w:val="555555"/>
-                <w:sz w:val="19"/>
-                <w:szCs w:val="19"/>
-              </w:rPr>
-              <w:t xml:space="preserve"> avec la latence P95, le trafic et le taux d’erreurs, générateur de trafic actif.</w:t>
+              <w:t>Capturer le tableau Golden Signals avec la latence P95, le trafic et le taux d’erreurs, générateur de trafic actif.</w:t>
             </w:r>
           </w:p>
           <w:p>
             <w:pPr>
               <w:jc w:val="center"/>
             </w:pPr>
-            <w:proofErr w:type="gramStart"/>
             <w:r>
               <w:rPr>
                 <w:color w:val="9DB8D2"/>
                 <w:sz w:val="18"/>
                 <w:szCs w:val="18"/>
               </w:rPr>
-              <w:t>[ Insérer</w:t>
-            </w:r>
-            <w:proofErr w:type="gramEnd"/>
-            <w:r>
-              <w:rPr>
-                <w:color w:val="9DB8D2"/>
-                <w:sz w:val="18"/>
-                <w:szCs w:val="18"/>
-              </w:rPr>
-              <w:t xml:space="preserve"> la capture d’écran ici ]</w:t>
+              <w:t>[ Insérer la capture d’écran ici ]</w:t>
             </w:r>
           </w:p>
         </w:tc>
@@ -6773,58 +4736,10 @@
         <w:jc w:val="both"/>
       </w:pPr>
       <w:r>
-        <w:t xml:space="preserve">Les cinq règles d’alerte natives sont provisionnées dans </w:t>
-      </w:r>
-      <w:proofErr w:type="spellStart"/>
-      <w:r>
-        <w:t>Grafana</w:t>
-      </w:r>
-      <w:proofErr w:type="spellEnd"/>
-      <w:r>
-        <w:t xml:space="preserve">. Ouvrez </w:t>
-      </w:r>
-      <w:r>
-        <w:t xml:space="preserve">« </w:t>
-      </w:r>
-      <w:proofErr w:type="spellStart"/>
-      <w:r>
-        <w:t>Alerting</w:t>
-      </w:r>
-      <w:proofErr w:type="spellEnd"/>
-      <w:r>
-        <w:t xml:space="preserve"> → </w:t>
-      </w:r>
-      <w:proofErr w:type="spellStart"/>
-      <w:r>
-        <w:t>Alert</w:t>
-      </w:r>
-      <w:proofErr w:type="spellEnd"/>
-      <w:r>
-        <w:t xml:space="preserve"> </w:t>
-      </w:r>
-      <w:proofErr w:type="spellStart"/>
-      <w:r>
-        <w:t>rules</w:t>
-      </w:r>
-      <w:proofErr w:type="spellEnd"/>
-      <w:r>
-        <w:t xml:space="preserve"> » pour les visualiser et constater leur état (Normal, </w:t>
-      </w:r>
-      <w:proofErr w:type="spellStart"/>
-      <w:r>
-        <w:t>Pending</w:t>
-      </w:r>
-      <w:proofErr w:type="spellEnd"/>
-      <w:r>
-        <w:t xml:space="preserve"> ou </w:t>
-      </w:r>
-      <w:proofErr w:type="spellStart"/>
-      <w:r>
-        <w:t>Firing</w:t>
-      </w:r>
-      <w:proofErr w:type="spellEnd"/>
-      <w:r>
-        <w:t>). Pour valider concrètement le déclenchement, vous pouvez provoquer une charge artificielle, par exemple en saturant le processeur d’une VM.</w:t>
+        <w:t xml:space="preserve">Les cinq règles d’alerte natives sont provisionnées dans Grafana. Ouvrez </w:t>
+      </w:r>
+      <w:r>
+        <w:t>« Alerting → Alert rules » pour les visualiser et constater leur état (Normal, Pending ou Firing). Pour valider concrètement le déclenchement, vous pouvez provoquer une charge artificielle, par exemple en saturant le processeur d’une VM.</w:t>
       </w:r>
     </w:p>
     <w:tbl>
@@ -6875,8 +4790,6 @@
             <w:pPr>
               <w:spacing w:after="40"/>
             </w:pPr>
-            <w:proofErr w:type="spellStart"/>
-            <w:proofErr w:type="gramStart"/>
             <w:r>
               <w:rPr>
                 <w:rFonts w:ascii="Consolas" w:eastAsia="Consolas" w:hAnsi="Consolas" w:cs="Consolas"/>
@@ -6888,8 +4801,6 @@
               </w:rPr>
               <w:t>bash</w:t>
             </w:r>
-            <w:proofErr w:type="spellEnd"/>
-            <w:proofErr w:type="gramEnd"/>
           </w:p>
           <w:p>
             <w:r>
@@ -6910,9 +4821,10 @@
                 <w:sz w:val="17"/>
                 <w:szCs w:val="17"/>
               </w:rPr>
-              <w:t xml:space="preserve"># yes occupe un cœur à 100 % ; </w:t>
-            </w:r>
-            <w:proofErr w:type="spellStart"/>
+              <w:t># yes occupe un cœur à 100 % ; Ctrl+C pour arrêter</w:t>
+            </w:r>
+          </w:p>
+          <w:p>
             <w:r>
               <w:rPr>
                 <w:rFonts w:ascii="Consolas" w:eastAsia="Consolas" w:hAnsi="Consolas" w:cs="Consolas"/>
@@ -6920,9 +4832,10 @@
                 <w:sz w:val="17"/>
                 <w:szCs w:val="17"/>
               </w:rPr>
-              <w:t>Ctrl+C</w:t>
-            </w:r>
-            <w:proofErr w:type="spellEnd"/>
+              <w:t>$ yes &gt; /dev/null &amp;</w:t>
+            </w:r>
+          </w:p>
+          <w:p>
             <w:r>
               <w:rPr>
                 <w:rFonts w:ascii="Consolas" w:eastAsia="Consolas" w:hAnsi="Consolas" w:cs="Consolas"/>
@@ -6930,69 +4843,7 @@
                 <w:sz w:val="17"/>
                 <w:szCs w:val="17"/>
               </w:rPr>
-              <w:t xml:space="preserve"> pour arrêter</w:t>
-            </w:r>
-          </w:p>
-          <w:p>
-            <w:r>
-              <w:rPr>
-                <w:rFonts w:ascii="Consolas" w:eastAsia="Consolas" w:hAnsi="Consolas" w:cs="Consolas"/>
-                <w:color w:val="E6EDF3"/>
-                <w:sz w:val="17"/>
-                <w:szCs w:val="17"/>
-              </w:rPr>
-              <w:t>$ yes &gt; /dev/</w:t>
-            </w:r>
-            <w:proofErr w:type="spellStart"/>
-            <w:r>
-              <w:rPr>
-                <w:rFonts w:ascii="Consolas" w:eastAsia="Consolas" w:hAnsi="Consolas" w:cs="Consolas"/>
-                <w:color w:val="E6EDF3"/>
-                <w:sz w:val="17"/>
-                <w:szCs w:val="17"/>
-              </w:rPr>
-              <w:t>null</w:t>
-            </w:r>
-            <w:proofErr w:type="spellEnd"/>
-            <w:r>
-              <w:rPr>
-                <w:rFonts w:ascii="Consolas" w:eastAsia="Consolas" w:hAnsi="Consolas" w:cs="Consolas"/>
-                <w:color w:val="E6EDF3"/>
-                <w:sz w:val="17"/>
-                <w:szCs w:val="17"/>
-              </w:rPr>
-              <w:t xml:space="preserve"> &amp;</w:t>
-            </w:r>
-          </w:p>
-          <w:p>
-            <w:r>
-              <w:rPr>
-                <w:rFonts w:ascii="Consolas" w:eastAsia="Consolas" w:hAnsi="Consolas" w:cs="Consolas"/>
-                <w:color w:val="E6EDF3"/>
-                <w:sz w:val="17"/>
-                <w:szCs w:val="17"/>
-              </w:rPr>
-              <w:t>$ yes &gt; /dev/</w:t>
-            </w:r>
-            <w:proofErr w:type="spellStart"/>
-            <w:r>
-              <w:rPr>
-                <w:rFonts w:ascii="Consolas" w:eastAsia="Consolas" w:hAnsi="Consolas" w:cs="Consolas"/>
-                <w:color w:val="E6EDF3"/>
-                <w:sz w:val="17"/>
-                <w:szCs w:val="17"/>
-              </w:rPr>
-              <w:t>null</w:t>
-            </w:r>
-            <w:proofErr w:type="spellEnd"/>
-            <w:r>
-              <w:rPr>
-                <w:rFonts w:ascii="Consolas" w:eastAsia="Consolas" w:hAnsi="Consolas" w:cs="Consolas"/>
-                <w:color w:val="E6EDF3"/>
-                <w:sz w:val="17"/>
-                <w:szCs w:val="17"/>
-              </w:rPr>
-              <w:t xml:space="preserve"> &amp;</w:t>
+              <w:t>$ yes &gt; /dev/null &amp;</w:t>
             </w:r>
           </w:p>
         </w:tc>
@@ -7060,7 +4911,6 @@
               <w:spacing w:after="60"/>
               <w:jc w:val="center"/>
             </w:pPr>
-            <w:proofErr w:type="gramStart"/>
             <w:r>
               <w:rPr>
                 <w:b/>
@@ -7079,18 +4929,7 @@
                 <w:sz w:val="21"/>
                 <w:szCs w:val="21"/>
               </w:rPr>
-              <w:t xml:space="preserve">  Capture</w:t>
-            </w:r>
-            <w:proofErr w:type="gramEnd"/>
-            <w:r>
-              <w:rPr>
-                <w:b/>
-                <w:bCs/>
-                <w:color w:val="1F3A5F"/>
-                <w:sz w:val="21"/>
-                <w:szCs w:val="21"/>
-              </w:rPr>
-              <w:t xml:space="preserve"> 7 — Alerte déclenchée et notification Slack</w:t>
+              <w:t xml:space="preserve">  Capture 7 — Alerte déclenchée et notification Slack</w:t>
             </w:r>
           </w:p>
           <w:p>
@@ -7106,9 +4945,8 @@
                 <w:sz w:val="19"/>
                 <w:szCs w:val="19"/>
               </w:rPr>
-              <w:t xml:space="preserve">Capturer la règle à l’état </w:t>
-            </w:r>
-            <w:proofErr w:type="spellStart"/>
+              <w:t>Capturer la règle à l’état Firing dans Grafana, et la notificati</w:t>
+            </w:r>
             <w:r>
               <w:rPr>
                 <w:i/>
@@ -7117,49 +4955,6 @@
                 <w:sz w:val="19"/>
                 <w:szCs w:val="19"/>
               </w:rPr>
-              <w:t>Firing</w:t>
-            </w:r>
-            <w:proofErr w:type="spellEnd"/>
-            <w:r>
-              <w:rPr>
-                <w:i/>
-                <w:iCs/>
-                <w:color w:val="555555"/>
-                <w:sz w:val="19"/>
-                <w:szCs w:val="19"/>
-              </w:rPr>
-              <w:t xml:space="preserve"> dans </w:t>
-            </w:r>
-            <w:proofErr w:type="spellStart"/>
-            <w:r>
-              <w:rPr>
-                <w:i/>
-                <w:iCs/>
-                <w:color w:val="555555"/>
-                <w:sz w:val="19"/>
-                <w:szCs w:val="19"/>
-              </w:rPr>
-              <w:t>Grafana</w:t>
-            </w:r>
-            <w:proofErr w:type="spellEnd"/>
-            <w:r>
-              <w:rPr>
-                <w:i/>
-                <w:iCs/>
-                <w:color w:val="555555"/>
-                <w:sz w:val="19"/>
-                <w:szCs w:val="19"/>
-              </w:rPr>
-              <w:t>, et la notificati</w:t>
-            </w:r>
-            <w:r>
-              <w:rPr>
-                <w:i/>
-                <w:iCs/>
-                <w:color w:val="555555"/>
-                <w:sz w:val="19"/>
-                <w:szCs w:val="19"/>
-              </w:rPr>
               <w:t>on reçue dans le canal Slack #monitoring ou #incidents.</w:t>
             </w:r>
           </w:p>
@@ -7167,23 +4962,13 @@
             <w:pPr>
               <w:jc w:val="center"/>
             </w:pPr>
-            <w:proofErr w:type="gramStart"/>
             <w:r>
               <w:rPr>
                 <w:color w:val="9DB8D2"/>
                 <w:sz w:val="18"/>
                 <w:szCs w:val="18"/>
               </w:rPr>
-              <w:t>[ Insérer</w:t>
-            </w:r>
-            <w:proofErr w:type="gramEnd"/>
-            <w:r>
-              <w:rPr>
-                <w:color w:val="9DB8D2"/>
-                <w:sz w:val="18"/>
-                <w:szCs w:val="18"/>
-              </w:rPr>
-              <w:t xml:space="preserve"> la capture d’écran ici ]</w:t>
+              <w:t>[ Insérer la capture d’écran ici ]</w:t>
             </w:r>
           </w:p>
         </w:tc>
@@ -7263,81 +5048,15 @@
                 <w:sz w:val="20"/>
                 <w:szCs w:val="20"/>
               </w:rPr>
-              <w:t xml:space="preserve">Avant de tester les notifications, complétez les marqueurs des fichiers de configuration : l’URL du </w:t>
-            </w:r>
-            <w:proofErr w:type="spellStart"/>
+              <w:t xml:space="preserve">Avant de tester les notifications, complétez les marqueurs des fichiers de configuration : l’URL du webhook Slack (dans alertmanager.yml et contactpoints.yaml) ainsi que l’identifiant et le mot de passe </w:t>
+            </w:r>
             <w:r>
               <w:rPr>
                 <w:sz w:val="20"/>
                 <w:szCs w:val="20"/>
               </w:rPr>
-              <w:t>webhook</w:t>
-            </w:r>
-            <w:proofErr w:type="spellEnd"/>
-            <w:r>
-              <w:rPr>
-                <w:sz w:val="20"/>
-                <w:szCs w:val="20"/>
-              </w:rPr>
-              <w:t xml:space="preserve"> Slack (dans </w:t>
-            </w:r>
-            <w:proofErr w:type="spellStart"/>
-            <w:r>
-              <w:rPr>
-                <w:sz w:val="20"/>
-                <w:szCs w:val="20"/>
-              </w:rPr>
-              <w:t>alertmanager.yml</w:t>
-            </w:r>
-            <w:proofErr w:type="spellEnd"/>
-            <w:r>
-              <w:rPr>
-                <w:sz w:val="20"/>
-                <w:szCs w:val="20"/>
-              </w:rPr>
-              <w:t xml:space="preserve"> et </w:t>
-            </w:r>
-            <w:proofErr w:type="spellStart"/>
-            <w:proofErr w:type="gramStart"/>
-            <w:r>
-              <w:rPr>
-                <w:sz w:val="20"/>
-                <w:szCs w:val="20"/>
-              </w:rPr>
-              <w:t>contactpoints.yaml</w:t>
-            </w:r>
-            <w:proofErr w:type="spellEnd"/>
-            <w:proofErr w:type="gramEnd"/>
-            <w:r>
-              <w:rPr>
-                <w:sz w:val="20"/>
-                <w:szCs w:val="20"/>
-              </w:rPr>
-              <w:t xml:space="preserve">) ainsi que l’identifiant et le mot de passe </w:t>
-            </w:r>
-            <w:r>
-              <w:rPr>
-                <w:sz w:val="20"/>
-                <w:szCs w:val="20"/>
-              </w:rPr>
               <w:lastRenderedPageBreak/>
-              <w:t xml:space="preserve">SMTP (dans </w:t>
-            </w:r>
-            <w:proofErr w:type="spellStart"/>
-            <w:r>
-              <w:rPr>
-                <w:sz w:val="20"/>
-                <w:szCs w:val="20"/>
-              </w:rPr>
-              <w:t>alertmanager.yml</w:t>
-            </w:r>
-            <w:proofErr w:type="spellEnd"/>
-            <w:r>
-              <w:rPr>
-                <w:sz w:val="20"/>
-                <w:szCs w:val="20"/>
-              </w:rPr>
-              <w:t>). Tant que ces valeurs ne</w:t>
+              <w:t>SMTP (dans alertmanager.yml). Tant que ces valeurs ne</w:t>
             </w:r>
             <w:r>
               <w:rPr>
@@ -7646,7 +5365,6 @@
             <w:vAlign w:val="center"/>
           </w:tcPr>
           <w:p>
-            <w:proofErr w:type="spellStart"/>
             <w:r>
               <w:rPr>
                 <w:color w:val="000000"/>
@@ -7655,7 +5373,6 @@
               </w:rPr>
               <w:t>Prometheus</w:t>
             </w:r>
-            <w:proofErr w:type="spellEnd"/>
           </w:p>
         </w:tc>
         <w:tc>
@@ -7683,36 +5400,8 @@
                 <w:sz w:val="19"/>
                 <w:szCs w:val="19"/>
               </w:rPr>
-              <w:t xml:space="preserve">Page </w:t>
-            </w:r>
-            <w:proofErr w:type="spellStart"/>
-            <w:r>
-              <w:rPr>
-                <w:color w:val="000000"/>
-                <w:sz w:val="19"/>
-                <w:szCs w:val="19"/>
-              </w:rPr>
-              <w:t>Targets</w:t>
-            </w:r>
-            <w:proofErr w:type="spellEnd"/>
-            <w:r>
-              <w:rPr>
-                <w:color w:val="000000"/>
-                <w:sz w:val="19"/>
-                <w:szCs w:val="19"/>
-              </w:rPr>
-              <w:t xml:space="preserve">, cibles UP, exemple de requête </w:t>
-            </w:r>
-            <w:proofErr w:type="spellStart"/>
-            <w:r>
-              <w:rPr>
-                <w:color w:val="000000"/>
-                <w:sz w:val="19"/>
-                <w:szCs w:val="19"/>
-              </w:rPr>
-              <w:t>PromQL</w:t>
-            </w:r>
-            <w:proofErr w:type="spellEnd"/>
+              <w:t>Page Targets, cibles UP, exemple de requête PromQL</w:t>
+            </w:r>
           </w:p>
         </w:tc>
       </w:tr>
@@ -7872,18 +5561,8 @@
                 <w:sz w:val="19"/>
                 <w:szCs w:val="19"/>
               </w:rPr>
-              <w:t xml:space="preserve">Tableau Golden </w:t>
-            </w:r>
-            <w:proofErr w:type="spellStart"/>
-            <w:r>
-              <w:rPr>
-                <w:color w:val="000000"/>
-                <w:sz w:val="19"/>
-                <w:szCs w:val="19"/>
-              </w:rPr>
-              <w:t>Signals</w:t>
-            </w:r>
-            <w:proofErr w:type="spellEnd"/>
+              <w:t>Tableau Golden Signals</w:t>
+            </w:r>
           </w:p>
         </w:tc>
         <w:tc>
@@ -8118,102 +5797,12 @@
         <w:jc w:val="both"/>
       </w:pPr>
       <w:r>
-        <w:t xml:space="preserve">Préparez la démonstration en lançant le générateur de trafic quelques minutes à l’avance, afin que les courbes soient déjà alimentées au moment de la présentation. Gardez ouverts, dans des onglets distincts, </w:t>
-      </w:r>
-      <w:proofErr w:type="spellStart"/>
-      <w:r>
-        <w:t>Prometheus</w:t>
-      </w:r>
-      <w:proofErr w:type="spellEnd"/>
-      <w:r>
-        <w:t>, les deux tableaux de bord et la page</w:t>
+        <w:t>Préparez la démonstration en lançant le générateur de trafic quelques minutes à l’avance, afin que les courbes soient déjà alimentées au moment de la présentation. Gardez ouverts, dans des onglets distincts, Prometheus, les deux tableaux de bord et la page</w:t>
       </w:r>
       <w:r>
         <w:t xml:space="preserve"> des alertes, pour enchaîner sans temps mort.</w:t>
       </w:r>
     </w:p>
-    <w:tbl>
-      <w:tblPr>
-        <w:tblW w:w="9360" w:type="dxa"/>
-        <w:tblBorders>
-          <w:top w:val="single" w:sz="4" w:space="0" w:color="auto"/>
-          <w:left w:val="single" w:sz="4" w:space="0" w:color="auto"/>
-          <w:bottom w:val="single" w:sz="4" w:space="0" w:color="auto"/>
-          <w:right w:val="single" w:sz="4" w:space="0" w:color="auto"/>
-          <w:insideH w:val="single" w:sz="4" w:space="0" w:color="auto"/>
-          <w:insideV w:val="single" w:sz="4" w:space="0" w:color="auto"/>
-        </w:tblBorders>
-        <w:tblCellMar>
-          <w:left w:w="10" w:type="dxa"/>
-          <w:right w:w="10" w:type="dxa"/>
-        </w:tblCellMar>
-        <w:tblLook w:val="04A0" w:firstRow="1" w:lastRow="0" w:firstColumn="1" w:lastColumn="0" w:noHBand="0" w:noVBand="1"/>
-      </w:tblPr>
-      <w:tblGrid>
-        <w:gridCol w:w="9360"/>
-      </w:tblGrid>
-      <w:tr>
-        <w:tblPrEx>
-          <w:tblCellMar>
-            <w:top w:w="0" w:type="dxa"/>
-            <w:bottom w:w="0" w:type="dxa"/>
-          </w:tblCellMar>
-        </w:tblPrEx>
-        <w:tc>
-          <w:tcPr>
-            <w:tcW w:w="9360" w:type="dxa"/>
-            <w:tcBorders>
-              <w:top w:val="single" w:sz="4" w:space="6" w:color="E0A800"/>
-              <w:left w:val="single" w:sz="4" w:space="6" w:color="E0A800"/>
-              <w:bottom w:val="single" w:sz="4" w:space="6" w:color="E0A800"/>
-              <w:right w:val="single" w:sz="4" w:space="6" w:color="E0A800"/>
-            </w:tcBorders>
-            <w:shd w:val="clear" w:color="auto" w:fill="FFF7E6"/>
-            <w:tcMar>
-              <w:top w:w="140" w:type="dxa"/>
-              <w:left w:w="180" w:type="dxa"/>
-              <w:bottom w:w="140" w:type="dxa"/>
-              <w:right w:w="180" w:type="dxa"/>
-            </w:tcMar>
-          </w:tcPr>
-          <w:p>
-            <w:pPr>
-              <w:spacing w:after="60"/>
-            </w:pPr>
-            <w:r>
-              <w:rPr>
-                <w:b/>
-                <w:bCs/>
-                <w:color w:val="8A6D00"/>
-                <w:sz w:val="21"/>
-                <w:szCs w:val="21"/>
-              </w:rPr>
-              <w:t>Conseil pour la soutenance</w:t>
-            </w:r>
-          </w:p>
-          <w:p>
-            <w:pPr>
-              <w:spacing w:after="40" w:line="264" w:lineRule="auto"/>
-              <w:jc w:val="both"/>
-            </w:pPr>
-            <w:r>
-              <w:rPr>
-                <w:sz w:val="20"/>
-                <w:szCs w:val="20"/>
-              </w:rPr>
-              <w:t>Racontez une histoire plutôt que d’énumérer des écrans : partez d’un symptôme (une latence qui grimpe, un CPU qui sature), montrez comment le tableau de bord le révèle, puis comment l</w:t>
-            </w:r>
-            <w:r>
-              <w:rPr>
-                <w:sz w:val="20"/>
-                <w:szCs w:val="20"/>
-              </w:rPr>
-              <w:t>’alerte le signale. C’est la démarche d’observabilité — du « quoi » au « pourquoi » — qui valorise le travail.</w:t>
-            </w:r>
-          </w:p>
-        </w:tc>
-      </w:tr>
-    </w:tbl>
     <w:p>
       <w:pPr>
         <w:pStyle w:val="Titre1"/>
@@ -8230,31 +5819,7 @@
         <w:jc w:val="both"/>
       </w:pPr>
       <w:r>
-        <w:t xml:space="preserve">En suivant ce guide, vous obtenez une plateforme de supervision complète et fonctionnelle, déployée sur trois machines virtuelles et entièrement reproductible. Chaque brique — </w:t>
-      </w:r>
-      <w:proofErr w:type="spellStart"/>
-      <w:r>
-        <w:t>Prometheus</w:t>
-      </w:r>
-      <w:proofErr w:type="spellEnd"/>
-      <w:r>
-        <w:t xml:space="preserve">, Node Exporter, </w:t>
-      </w:r>
-      <w:proofErr w:type="spellStart"/>
-      <w:r>
-        <w:t>Grafana</w:t>
-      </w:r>
-      <w:proofErr w:type="spellEnd"/>
-      <w:r>
-        <w:t xml:space="preserve">, </w:t>
-      </w:r>
-      <w:proofErr w:type="spellStart"/>
-      <w:r>
-        <w:t>AlertManager</w:t>
-      </w:r>
-      <w:proofErr w:type="spellEnd"/>
-      <w:r>
-        <w:t>, application instrumentée, base</w:t>
+        <w:t>En suivant ce guide, vous obtenez une plateforme de supervision complète et fonctionnelle, déployée sur trois machines virtuelles et entièrement reproductible. Chaque brique — Prometheus, Node Exporter, Grafana, AlertManager, application instrumentée, base</w:t>
       </w:r>
       <w:r>
         <w:t xml:space="preserve"> de données — a été installée, configurée et vérifiée, et les zones de capture vous permettent de documenter chacune des preuves attendues par les livrables.</w:t>

</xml_diff>